<commit_message>
Keypad e Neopixel e Codigos PushButton Imagens e 7 Segmentos Imagem
Keypad e Neopixel e Codigos PushButton Imagens e 7 Segmentos Imagem
</commit_message>
<xml_diff>
--- a/Apostilas/Keypad.docx
+++ b/Apostilas/Keypad.docx
@@ -30,22 +30,14 @@
         <w:rPr>
           <w:lang w:val="en-US" w:bidi="pt-BR"/>
         </w:rPr>
-        <w:t xml:space="preserve">This project uses an Arduino Nano to read keypad inputs and display the corresponding value in real time on a 7-segment </w:t>
-      </w:r>
-      <w:proofErr w:type="gramStart"/>
+        <w:t>This project uses an Arduino Nano to read keypad inputs and display the corresponding value in real time on a 7-segment display.</w:t>
+      </w:r>
       <w:r>
         <w:rPr>
           <w:lang w:val="en-US" w:bidi="pt-BR"/>
         </w:rPr>
-        <w:t>display.</w:t>
-      </w:r>
-      <w:r>
-        <w:rPr>
-          <w:lang w:val="en-US" w:bidi="pt-BR"/>
-        </w:rPr>
         <w:t>.</w:t>
       </w:r>
-      <w:proofErr w:type="gramEnd"/>
     </w:p>
     <w:p>
       <w:pPr>
@@ -128,13 +120,7 @@
         <w:rPr>
           <w:lang w:val="en-US" w:bidi="pt-BR"/>
         </w:rPr>
-        <w:t xml:space="preserve">1 </w:t>
-      </w:r>
-      <w:r>
-        <w:rPr>
-          <w:lang w:val="en-US" w:bidi="pt-BR"/>
-        </w:rPr>
-        <w:t>Arduino Nano Matter</w:t>
+        <w:t>1 Arduino Nano Matter</w:t>
       </w:r>
     </w:p>
     <w:p>
@@ -152,19 +138,7 @@
         <w:rPr>
           <w:lang w:val="en-US" w:bidi="pt-BR"/>
         </w:rPr>
-        <w:t>1</w:t>
-      </w:r>
-      <w:r>
-        <w:rPr>
-          <w:lang w:val="en-US" w:bidi="pt-BR"/>
-        </w:rPr>
-        <w:t xml:space="preserve"> </w:t>
-      </w:r>
-      <w:r>
-        <w:rPr>
-          <w:lang w:val="en-US" w:bidi="pt-BR"/>
-        </w:rPr>
-        <w:t>Button Keypad 4x4 module</w:t>
+        <w:t>1 Button Keypad 4x4 module</w:t>
       </w:r>
     </w:p>
     <w:p>
@@ -182,28 +156,26 @@
         <w:rPr>
           <w:lang w:val="en-US" w:bidi="pt-BR"/>
         </w:rPr>
-        <w:t>1</w:t>
+        <w:t>4</w:t>
       </w:r>
       <w:r>
         <w:rPr>
           <w:lang w:val="en-US" w:bidi="pt-BR"/>
         </w:rPr>
-        <w:t xml:space="preserve"> </w:t>
+        <w:t xml:space="preserve"> Resistor 220 oh</w:t>
       </w:r>
       <w:r>
         <w:rPr>
           <w:lang w:val="en-US" w:bidi="pt-BR"/>
         </w:rPr>
-        <w:t xml:space="preserve">Resistor 220 </w:t>
-      </w:r>
-      <w:proofErr w:type="spellStart"/>
+        <w:t>m</w:t>
+      </w:r>
       <w:r>
         <w:rPr>
           <w:lang w:val="en-US" w:bidi="pt-BR"/>
         </w:rPr>
-        <w:t>ohmios</w:t>
-      </w:r>
-      <w:proofErr w:type="spellEnd"/>
+        <w:t>s</w:t>
+      </w:r>
     </w:p>
     <w:p>
       <w:pPr>
@@ -220,42 +192,8 @@
         <w:rPr>
           <w:lang w:val="pt-BR" w:bidi="pt-BR"/>
         </w:rPr>
-        <w:t>1</w:t>
-      </w:r>
-      <w:r>
-        <w:rPr>
-          <w:lang w:val="pt-BR" w:bidi="pt-BR"/>
-        </w:rPr>
-        <w:t xml:space="preserve"> </w:t>
-      </w:r>
-      <w:r>
-        <w:rPr>
-          <w:lang w:val="pt-BR" w:bidi="pt-BR"/>
-        </w:rPr>
-        <w:t xml:space="preserve">7 </w:t>
-      </w:r>
-      <w:proofErr w:type="spellStart"/>
-      <w:r>
-        <w:rPr>
-          <w:lang w:val="pt-BR" w:bidi="pt-BR"/>
-        </w:rPr>
-        <w:t>Segment</w:t>
-      </w:r>
-      <w:proofErr w:type="spellEnd"/>
-      <w:r>
-        <w:rPr>
-          <w:lang w:val="pt-BR" w:bidi="pt-BR"/>
-        </w:rPr>
-        <w:t xml:space="preserve"> Display-Common </w:t>
-      </w:r>
-      <w:proofErr w:type="spellStart"/>
-      <w:r>
-        <w:rPr>
-          <w:lang w:val="pt-BR" w:bidi="pt-BR"/>
-        </w:rPr>
-        <w:t>Anode</w:t>
-      </w:r>
-      <w:proofErr w:type="spellEnd"/>
+        <w:t>1 7 Segment Display-Common Anode</w:t>
+      </w:r>
     </w:p>
     <w:p>
       <w:pPr>
@@ -489,7 +427,6 @@
           <w:lang w:val="en-US" w:eastAsia="pt-BR"/>
         </w:rPr>
       </w:pPr>
-      <w:proofErr w:type="gramStart"/>
       <w:r>
         <w:rPr>
           <w:rFonts w:ascii="Consolas" w:eastAsia="Times New Roman" w:hAnsi="Consolas" w:cs="Consolas"/>
@@ -500,7 +437,6 @@
         </w:rPr>
         <w:t>#include</w:t>
       </w:r>
-      <w:proofErr w:type="gramEnd"/>
       <w:r>
         <w:rPr>
           <w:rFonts w:ascii="Consolas" w:eastAsia="Times New Roman" w:hAnsi="Consolas" w:cs="Consolas"/>
@@ -519,41 +455,7 @@
           <w:szCs w:val="30"/>
           <w:lang w:val="en-US" w:eastAsia="pt-BR"/>
         </w:rPr>
-        <w:t>&lt;</w:t>
-      </w:r>
-      <w:proofErr w:type="spellStart"/>
-      <w:r>
-        <w:rPr>
-          <w:rFonts w:ascii="Consolas" w:eastAsia="Times New Roman" w:hAnsi="Consolas" w:cs="Consolas"/>
-          <w:color w:val="CE9178"/>
-          <w:sz w:val="30"/>
-          <w:szCs w:val="30"/>
-          <w:lang w:val="en-US" w:eastAsia="pt-BR"/>
-        </w:rPr>
-        <w:t>Keypad</w:t>
-      </w:r>
-      <w:proofErr w:type="gramStart"/>
-      <w:r>
-        <w:rPr>
-          <w:rFonts w:ascii="Consolas" w:eastAsia="Times New Roman" w:hAnsi="Consolas" w:cs="Consolas"/>
-          <w:color w:val="CE9178"/>
-          <w:sz w:val="30"/>
-          <w:szCs w:val="30"/>
-          <w:lang w:val="en-US" w:eastAsia="pt-BR"/>
-        </w:rPr>
-        <w:t>.h</w:t>
-      </w:r>
-      <w:proofErr w:type="spellEnd"/>
-      <w:proofErr w:type="gramEnd"/>
-      <w:r>
-        <w:rPr>
-          <w:rFonts w:ascii="Consolas" w:eastAsia="Times New Roman" w:hAnsi="Consolas" w:cs="Consolas"/>
-          <w:color w:val="CE9178"/>
-          <w:sz w:val="30"/>
-          <w:szCs w:val="30"/>
-          <w:lang w:val="en-US" w:eastAsia="pt-BR"/>
-        </w:rPr>
-        <w:t>&gt;</w:t>
+        <w:t>&lt;Keypad.h&gt;</w:t>
       </w:r>
     </w:p>
     <w:p>
@@ -644,7 +546,6 @@
         </w:rPr>
         <w:t xml:space="preserve"> </w:t>
       </w:r>
-      <w:proofErr w:type="gramStart"/>
       <w:r>
         <w:rPr>
           <w:rFonts w:ascii="Consolas" w:eastAsia="Times New Roman" w:hAnsi="Consolas" w:cs="Consolas"/>
@@ -665,7 +566,6 @@
         </w:rPr>
         <w:t>;</w:t>
       </w:r>
-      <w:proofErr w:type="gramEnd"/>
     </w:p>
     <w:p>
       <w:pPr>
@@ -719,7 +619,6 @@
         </w:rPr>
         <w:t xml:space="preserve"> </w:t>
       </w:r>
-      <w:proofErr w:type="gramStart"/>
       <w:r>
         <w:rPr>
           <w:rFonts w:ascii="Consolas" w:eastAsia="Times New Roman" w:hAnsi="Consolas" w:cs="Consolas"/>
@@ -740,7 +639,6 @@
         </w:rPr>
         <w:t>;</w:t>
       </w:r>
-      <w:proofErr w:type="gramEnd"/>
     </w:p>
     <w:p>
       <w:pPr>
@@ -787,7 +685,6 @@
         </w:rPr>
         <w:t xml:space="preserve"> </w:t>
       </w:r>
-      <w:proofErr w:type="gramStart"/>
       <w:r>
         <w:rPr>
           <w:rFonts w:ascii="Consolas" w:eastAsia="Times New Roman" w:hAnsi="Consolas" w:cs="Consolas"/>
@@ -806,18 +703,7 @@
           <w:szCs w:val="30"/>
           <w:lang w:val="en-US" w:eastAsia="pt-BR"/>
         </w:rPr>
-        <w:t>[</w:t>
-      </w:r>
-      <w:proofErr w:type="gramEnd"/>
-      <w:r>
-        <w:rPr>
-          <w:rFonts w:ascii="Consolas" w:eastAsia="Times New Roman" w:hAnsi="Consolas" w:cs="Consolas"/>
-          <w:color w:val="CCCCCC"/>
-          <w:sz w:val="30"/>
-          <w:szCs w:val="30"/>
-          <w:lang w:val="en-US" w:eastAsia="pt-BR"/>
-        </w:rPr>
-        <w:t xml:space="preserve">ROWS][COLS] </w:t>
+        <w:t xml:space="preserve">[ROWS][COLS] </w:t>
       </w:r>
       <w:r>
         <w:rPr>
@@ -930,18 +816,7 @@
           <w:szCs w:val="30"/>
           <w:lang w:val="en-US" w:eastAsia="pt-BR"/>
         </w:rPr>
-        <w:t>'</w:t>
-      </w:r>
-      <w:proofErr w:type="gramStart"/>
-      <w:r>
-        <w:rPr>
-          <w:rFonts w:ascii="Consolas" w:eastAsia="Times New Roman" w:hAnsi="Consolas" w:cs="Consolas"/>
-          <w:color w:val="CE9178"/>
-          <w:sz w:val="30"/>
-          <w:szCs w:val="30"/>
-          <w:lang w:val="en-US" w:eastAsia="pt-BR"/>
-        </w:rPr>
-        <w:t>A'</w:t>
+        <w:t>'A'</w:t>
       </w:r>
       <w:r>
         <w:rPr>
@@ -951,18 +826,7 @@
           <w:szCs w:val="30"/>
           <w:lang w:val="en-US" w:eastAsia="pt-BR"/>
         </w:rPr>
-        <w:t>}</w:t>
-      </w:r>
-      <w:proofErr w:type="gramEnd"/>
-      <w:r>
-        <w:rPr>
-          <w:rFonts w:ascii="Consolas" w:eastAsia="Times New Roman" w:hAnsi="Consolas" w:cs="Consolas"/>
-          <w:color w:val="CCCCCC"/>
-          <w:sz w:val="30"/>
-          <w:szCs w:val="30"/>
-          <w:lang w:val="en-US" w:eastAsia="pt-BR"/>
-        </w:rPr>
-        <w:t>,</w:t>
+        <w:t>},</w:t>
       </w:r>
     </w:p>
     <w:p>
@@ -1055,18 +919,7 @@
           <w:szCs w:val="30"/>
           <w:lang w:val="en-US" w:eastAsia="pt-BR"/>
         </w:rPr>
-        <w:t>'</w:t>
-      </w:r>
-      <w:proofErr w:type="gramStart"/>
-      <w:r>
-        <w:rPr>
-          <w:rFonts w:ascii="Consolas" w:eastAsia="Times New Roman" w:hAnsi="Consolas" w:cs="Consolas"/>
-          <w:color w:val="CE9178"/>
-          <w:sz w:val="30"/>
-          <w:szCs w:val="30"/>
-          <w:lang w:val="en-US" w:eastAsia="pt-BR"/>
-        </w:rPr>
-        <w:t>B'</w:t>
+        <w:t>'B'</w:t>
       </w:r>
       <w:r>
         <w:rPr>
@@ -1076,18 +929,7 @@
           <w:szCs w:val="30"/>
           <w:lang w:val="en-US" w:eastAsia="pt-BR"/>
         </w:rPr>
-        <w:t>}</w:t>
-      </w:r>
-      <w:proofErr w:type="gramEnd"/>
-      <w:r>
-        <w:rPr>
-          <w:rFonts w:ascii="Consolas" w:eastAsia="Times New Roman" w:hAnsi="Consolas" w:cs="Consolas"/>
-          <w:color w:val="CCCCCC"/>
-          <w:sz w:val="30"/>
-          <w:szCs w:val="30"/>
-          <w:lang w:val="en-US" w:eastAsia="pt-BR"/>
-        </w:rPr>
-        <w:t>,</w:t>
+        <w:t>},</w:t>
       </w:r>
     </w:p>
     <w:p>
@@ -1180,18 +1022,7 @@
           <w:szCs w:val="30"/>
           <w:lang w:val="en-US" w:eastAsia="pt-BR"/>
         </w:rPr>
-        <w:t>'</w:t>
-      </w:r>
-      <w:proofErr w:type="gramStart"/>
-      <w:r>
-        <w:rPr>
-          <w:rFonts w:ascii="Consolas" w:eastAsia="Times New Roman" w:hAnsi="Consolas" w:cs="Consolas"/>
-          <w:color w:val="CE9178"/>
-          <w:sz w:val="30"/>
-          <w:szCs w:val="30"/>
-          <w:lang w:val="en-US" w:eastAsia="pt-BR"/>
-        </w:rPr>
-        <w:t>C'</w:t>
+        <w:t>'C'</w:t>
       </w:r>
       <w:r>
         <w:rPr>
@@ -1201,18 +1032,7 @@
           <w:szCs w:val="30"/>
           <w:lang w:val="en-US" w:eastAsia="pt-BR"/>
         </w:rPr>
-        <w:t>}</w:t>
-      </w:r>
-      <w:proofErr w:type="gramEnd"/>
-      <w:r>
-        <w:rPr>
-          <w:rFonts w:ascii="Consolas" w:eastAsia="Times New Roman" w:hAnsi="Consolas" w:cs="Consolas"/>
-          <w:color w:val="CCCCCC"/>
-          <w:sz w:val="30"/>
-          <w:szCs w:val="30"/>
-          <w:lang w:val="en-US" w:eastAsia="pt-BR"/>
-        </w:rPr>
-        <w:t>,</w:t>
+        <w:t>},</w:t>
       </w:r>
     </w:p>
     <w:p>
@@ -1265,9 +1085,18 @@
           <w:szCs w:val="30"/>
           <w:lang w:val="en-US" w:eastAsia="pt-BR"/>
         </w:rPr>
-        <w:t>'0</w:t>
-      </w:r>
-      <w:proofErr w:type="gramStart"/>
+        <w:t>'0'</w:t>
+      </w:r>
+      <w:r>
+        <w:rPr>
+          <w:rFonts w:ascii="Consolas" w:eastAsia="Times New Roman" w:hAnsi="Consolas" w:cs="Consolas"/>
+          <w:color w:val="CCCCCC"/>
+          <w:sz w:val="30"/>
+          <w:szCs w:val="30"/>
+          <w:lang w:val="en-US" w:eastAsia="pt-BR"/>
+        </w:rPr>
+        <w:t>,</w:t>
+      </w:r>
       <w:r>
         <w:rPr>
           <w:rFonts w:ascii="Consolas" w:eastAsia="Times New Roman" w:hAnsi="Consolas" w:cs="Consolas"/>
@@ -1276,7 +1105,7 @@
           <w:szCs w:val="30"/>
           <w:lang w:val="en-US" w:eastAsia="pt-BR"/>
         </w:rPr>
-        <w:t>'</w:t>
+        <w:t>'#'</w:t>
       </w:r>
       <w:r>
         <w:rPr>
@@ -1296,18 +1125,7 @@
           <w:szCs w:val="30"/>
           <w:lang w:val="en-US" w:eastAsia="pt-BR"/>
         </w:rPr>
-        <w:t>'#</w:t>
-      </w:r>
-      <w:proofErr w:type="gramEnd"/>
-      <w:r>
-        <w:rPr>
-          <w:rFonts w:ascii="Consolas" w:eastAsia="Times New Roman" w:hAnsi="Consolas" w:cs="Consolas"/>
-          <w:color w:val="CE9178"/>
-          <w:sz w:val="30"/>
-          <w:szCs w:val="30"/>
-          <w:lang w:val="en-US" w:eastAsia="pt-BR"/>
-        </w:rPr>
-        <w:t>'</w:t>
+        <w:t>'D'</w:t>
       </w:r>
       <w:r>
         <w:rPr>
@@ -1317,40 +1135,8 @@
           <w:szCs w:val="30"/>
           <w:lang w:val="en-US" w:eastAsia="pt-BR"/>
         </w:rPr>
-        <w:t>,</w:t>
-      </w:r>
-      <w:r>
-        <w:rPr>
-          <w:rFonts w:ascii="Consolas" w:eastAsia="Times New Roman" w:hAnsi="Consolas" w:cs="Consolas"/>
-          <w:color w:val="CE9178"/>
-          <w:sz w:val="30"/>
-          <w:szCs w:val="30"/>
-          <w:lang w:val="en-US" w:eastAsia="pt-BR"/>
-        </w:rPr>
-        <w:t>'</w:t>
-      </w:r>
-      <w:proofErr w:type="gramStart"/>
-      <w:r>
-        <w:rPr>
-          <w:rFonts w:ascii="Consolas" w:eastAsia="Times New Roman" w:hAnsi="Consolas" w:cs="Consolas"/>
-          <w:color w:val="CE9178"/>
-          <w:sz w:val="30"/>
-          <w:szCs w:val="30"/>
-          <w:lang w:val="en-US" w:eastAsia="pt-BR"/>
-        </w:rPr>
-        <w:t>D'</w:t>
-      </w:r>
-      <w:r>
-        <w:rPr>
-          <w:rFonts w:ascii="Consolas" w:eastAsia="Times New Roman" w:hAnsi="Consolas" w:cs="Consolas"/>
-          <w:color w:val="CCCCCC"/>
-          <w:sz w:val="30"/>
-          <w:szCs w:val="30"/>
-          <w:lang w:val="en-US" w:eastAsia="pt-BR"/>
-        </w:rPr>
         <w:t>}</w:t>
       </w:r>
-      <w:proofErr w:type="gramEnd"/>
     </w:p>
     <w:p>
       <w:pPr>
@@ -1364,7 +1150,6 @@
           <w:lang w:val="en-US" w:eastAsia="pt-BR"/>
         </w:rPr>
       </w:pPr>
-      <w:proofErr w:type="gramStart"/>
       <w:r>
         <w:rPr>
           <w:rFonts w:ascii="Consolas" w:eastAsia="Times New Roman" w:hAnsi="Consolas" w:cs="Consolas"/>
@@ -1375,7 +1160,6 @@
         </w:rPr>
         <w:t>};</w:t>
       </w:r>
-      <w:proofErr w:type="gramEnd"/>
     </w:p>
     <w:p>
       <w:pPr>
@@ -1413,8 +1197,6 @@
         <w:lastRenderedPageBreak/>
         <w:t xml:space="preserve">byte </w:t>
       </w:r>
-      <w:proofErr w:type="spellStart"/>
-      <w:proofErr w:type="gramStart"/>
       <w:r>
         <w:rPr>
           <w:rFonts w:ascii="Consolas" w:eastAsia="Times New Roman" w:hAnsi="Consolas" w:cs="Consolas"/>
@@ -1425,7 +1207,6 @@
         </w:rPr>
         <w:t>rowPins</w:t>
       </w:r>
-      <w:proofErr w:type="spellEnd"/>
       <w:r>
         <w:rPr>
           <w:rFonts w:ascii="Consolas" w:eastAsia="Times New Roman" w:hAnsi="Consolas" w:cs="Consolas"/>
@@ -1434,9 +1215,18 @@
           <w:szCs w:val="30"/>
           <w:lang w:val="en-US" w:eastAsia="pt-BR"/>
         </w:rPr>
-        <w:t>[</w:t>
-      </w:r>
-      <w:proofErr w:type="gramEnd"/>
+        <w:t xml:space="preserve">[ROWS] </w:t>
+      </w:r>
+      <w:r>
+        <w:rPr>
+          <w:rFonts w:ascii="Consolas" w:eastAsia="Times New Roman" w:hAnsi="Consolas" w:cs="Consolas"/>
+          <w:color w:val="D4D4D4"/>
+          <w:sz w:val="30"/>
+          <w:szCs w:val="30"/>
+          <w:lang w:val="en-US" w:eastAsia="pt-BR"/>
+        </w:rPr>
+        <w:t>=</w:t>
+      </w:r>
       <w:r>
         <w:rPr>
           <w:rFonts w:ascii="Consolas" w:eastAsia="Times New Roman" w:hAnsi="Consolas" w:cs="Consolas"/>
@@ -1445,17 +1235,17 @@
           <w:szCs w:val="30"/>
           <w:lang w:val="en-US" w:eastAsia="pt-BR"/>
         </w:rPr>
-        <w:t xml:space="preserve">ROWS] </w:t>
-      </w:r>
-      <w:r>
-        <w:rPr>
-          <w:rFonts w:ascii="Consolas" w:eastAsia="Times New Roman" w:hAnsi="Consolas" w:cs="Consolas"/>
-          <w:color w:val="D4D4D4"/>
-          <w:sz w:val="30"/>
-          <w:szCs w:val="30"/>
-          <w:lang w:val="en-US" w:eastAsia="pt-BR"/>
-        </w:rPr>
-        <w:t>=</w:t>
+        <w:t xml:space="preserve"> {</w:t>
+      </w:r>
+      <w:r>
+        <w:rPr>
+          <w:rFonts w:ascii="Consolas" w:eastAsia="Times New Roman" w:hAnsi="Consolas" w:cs="Consolas"/>
+          <w:color w:val="B5CEA8"/>
+          <w:sz w:val="30"/>
+          <w:szCs w:val="30"/>
+          <w:lang w:val="en-US" w:eastAsia="pt-BR"/>
+        </w:rPr>
+        <w:t>9</w:t>
       </w:r>
       <w:r>
         <w:rPr>
@@ -1465,7 +1255,7 @@
           <w:szCs w:val="30"/>
           <w:lang w:val="en-US" w:eastAsia="pt-BR"/>
         </w:rPr>
-        <w:t xml:space="preserve"> {</w:t>
+        <w:t xml:space="preserve">, </w:t>
       </w:r>
       <w:r>
         <w:rPr>
@@ -1475,7 +1265,7 @@
           <w:szCs w:val="30"/>
           <w:lang w:val="en-US" w:eastAsia="pt-BR"/>
         </w:rPr>
-        <w:t>9</w:t>
+        <w:t>8</w:t>
       </w:r>
       <w:r>
         <w:rPr>
@@ -1495,7 +1285,7 @@
           <w:szCs w:val="30"/>
           <w:lang w:val="en-US" w:eastAsia="pt-BR"/>
         </w:rPr>
-        <w:t>8</w:t>
+        <w:t>7</w:t>
       </w:r>
       <w:r>
         <w:rPr>
@@ -1515,7 +1305,7 @@
           <w:szCs w:val="30"/>
           <w:lang w:val="en-US" w:eastAsia="pt-BR"/>
         </w:rPr>
-        <w:t>7</w:t>
+        <w:t>6</w:t>
       </w:r>
       <w:r>
         <w:rPr>
@@ -1525,27 +1315,6 @@
           <w:szCs w:val="30"/>
           <w:lang w:val="en-US" w:eastAsia="pt-BR"/>
         </w:rPr>
-        <w:t xml:space="preserve">, </w:t>
-      </w:r>
-      <w:r>
-        <w:rPr>
-          <w:rFonts w:ascii="Consolas" w:eastAsia="Times New Roman" w:hAnsi="Consolas" w:cs="Consolas"/>
-          <w:color w:val="B5CEA8"/>
-          <w:sz w:val="30"/>
-          <w:szCs w:val="30"/>
-          <w:lang w:val="en-US" w:eastAsia="pt-BR"/>
-        </w:rPr>
-        <w:t>6</w:t>
-      </w:r>
-      <w:proofErr w:type="gramStart"/>
-      <w:r>
-        <w:rPr>
-          <w:rFonts w:ascii="Consolas" w:eastAsia="Times New Roman" w:hAnsi="Consolas" w:cs="Consolas"/>
-          <w:color w:val="CCCCCC"/>
-          <w:sz w:val="30"/>
-          <w:szCs w:val="30"/>
-          <w:lang w:val="en-US" w:eastAsia="pt-BR"/>
-        </w:rPr>
         <w:t>};</w:t>
       </w:r>
       <w:r>
@@ -1556,18 +1325,7 @@
           <w:szCs w:val="30"/>
           <w:lang w:val="en-US" w:eastAsia="pt-BR"/>
         </w:rPr>
-        <w:t xml:space="preserve">   </w:t>
-      </w:r>
-      <w:proofErr w:type="gramEnd"/>
-      <w:r>
-        <w:rPr>
-          <w:rFonts w:ascii="Consolas" w:eastAsia="Times New Roman" w:hAnsi="Consolas" w:cs="Consolas"/>
-          <w:color w:val="6A9955"/>
-          <w:sz w:val="30"/>
-          <w:szCs w:val="30"/>
-          <w:lang w:val="en-US" w:eastAsia="pt-BR"/>
-        </w:rPr>
-        <w:t>// Connect to keypad ROW pins</w:t>
+        <w:t xml:space="preserve">   // Connect to keypad ROW pins</w:t>
       </w:r>
     </w:p>
     <w:p>
@@ -1592,8 +1350,6 @@
         </w:rPr>
         <w:t xml:space="preserve">byte </w:t>
       </w:r>
-      <w:proofErr w:type="spellStart"/>
-      <w:proofErr w:type="gramStart"/>
       <w:r>
         <w:rPr>
           <w:rFonts w:ascii="Consolas" w:eastAsia="Times New Roman" w:hAnsi="Consolas" w:cs="Consolas"/>
@@ -1604,7 +1360,6 @@
         </w:rPr>
         <w:t>colPins</w:t>
       </w:r>
-      <w:proofErr w:type="spellEnd"/>
       <w:r>
         <w:rPr>
           <w:rFonts w:ascii="Consolas" w:eastAsia="Times New Roman" w:hAnsi="Consolas" w:cs="Consolas"/>
@@ -1613,9 +1368,18 @@
           <w:szCs w:val="30"/>
           <w:lang w:val="en-US" w:eastAsia="pt-BR"/>
         </w:rPr>
-        <w:t>[</w:t>
-      </w:r>
-      <w:proofErr w:type="gramEnd"/>
+        <w:t xml:space="preserve">[COLS] </w:t>
+      </w:r>
+      <w:r>
+        <w:rPr>
+          <w:rFonts w:ascii="Consolas" w:eastAsia="Times New Roman" w:hAnsi="Consolas" w:cs="Consolas"/>
+          <w:color w:val="D4D4D4"/>
+          <w:sz w:val="30"/>
+          <w:szCs w:val="30"/>
+          <w:lang w:val="en-US" w:eastAsia="pt-BR"/>
+        </w:rPr>
+        <w:t>=</w:t>
+      </w:r>
       <w:r>
         <w:rPr>
           <w:rFonts w:ascii="Consolas" w:eastAsia="Times New Roman" w:hAnsi="Consolas" w:cs="Consolas"/>
@@ -1624,17 +1388,17 @@
           <w:szCs w:val="30"/>
           <w:lang w:val="en-US" w:eastAsia="pt-BR"/>
         </w:rPr>
-        <w:t xml:space="preserve">COLS] </w:t>
-      </w:r>
-      <w:r>
-        <w:rPr>
-          <w:rFonts w:ascii="Consolas" w:eastAsia="Times New Roman" w:hAnsi="Consolas" w:cs="Consolas"/>
-          <w:color w:val="D4D4D4"/>
-          <w:sz w:val="30"/>
-          <w:szCs w:val="30"/>
-          <w:lang w:val="en-US" w:eastAsia="pt-BR"/>
-        </w:rPr>
-        <w:t>=</w:t>
+        <w:t xml:space="preserve"> {</w:t>
+      </w:r>
+      <w:r>
+        <w:rPr>
+          <w:rFonts w:ascii="Consolas" w:eastAsia="Times New Roman" w:hAnsi="Consolas" w:cs="Consolas"/>
+          <w:color w:val="B5CEA8"/>
+          <w:sz w:val="30"/>
+          <w:szCs w:val="30"/>
+          <w:lang w:val="en-US" w:eastAsia="pt-BR"/>
+        </w:rPr>
+        <w:t>5</w:t>
       </w:r>
       <w:r>
         <w:rPr>
@@ -1644,7 +1408,7 @@
           <w:szCs w:val="30"/>
           <w:lang w:val="en-US" w:eastAsia="pt-BR"/>
         </w:rPr>
-        <w:t xml:space="preserve"> {</w:t>
+        <w:t xml:space="preserve">, </w:t>
       </w:r>
       <w:r>
         <w:rPr>
@@ -1654,7 +1418,7 @@
           <w:szCs w:val="30"/>
           <w:lang w:val="en-US" w:eastAsia="pt-BR"/>
         </w:rPr>
-        <w:t>5</w:t>
+        <w:t>4</w:t>
       </w:r>
       <w:r>
         <w:rPr>
@@ -1674,7 +1438,7 @@
           <w:szCs w:val="30"/>
           <w:lang w:val="en-US" w:eastAsia="pt-BR"/>
         </w:rPr>
-        <w:t>4</w:t>
+        <w:t>3</w:t>
       </w:r>
       <w:r>
         <w:rPr>
@@ -1694,7 +1458,7 @@
           <w:szCs w:val="30"/>
           <w:lang w:val="en-US" w:eastAsia="pt-BR"/>
         </w:rPr>
-        <w:t>3</w:t>
+        <w:t>2</w:t>
       </w:r>
       <w:r>
         <w:rPr>
@@ -1704,27 +1468,6 @@
           <w:szCs w:val="30"/>
           <w:lang w:val="en-US" w:eastAsia="pt-BR"/>
         </w:rPr>
-        <w:t xml:space="preserve">, </w:t>
-      </w:r>
-      <w:r>
-        <w:rPr>
-          <w:rFonts w:ascii="Consolas" w:eastAsia="Times New Roman" w:hAnsi="Consolas" w:cs="Consolas"/>
-          <w:color w:val="B5CEA8"/>
-          <w:sz w:val="30"/>
-          <w:szCs w:val="30"/>
-          <w:lang w:val="en-US" w:eastAsia="pt-BR"/>
-        </w:rPr>
-        <w:t>2</w:t>
-      </w:r>
-      <w:proofErr w:type="gramStart"/>
-      <w:r>
-        <w:rPr>
-          <w:rFonts w:ascii="Consolas" w:eastAsia="Times New Roman" w:hAnsi="Consolas" w:cs="Consolas"/>
-          <w:color w:val="CCCCCC"/>
-          <w:sz w:val="30"/>
-          <w:szCs w:val="30"/>
-          <w:lang w:val="en-US" w:eastAsia="pt-BR"/>
-        </w:rPr>
         <w:t>};</w:t>
       </w:r>
       <w:r>
@@ -1735,18 +1478,7 @@
           <w:szCs w:val="30"/>
           <w:lang w:val="en-US" w:eastAsia="pt-BR"/>
         </w:rPr>
-        <w:t xml:space="preserve">   </w:t>
-      </w:r>
-      <w:proofErr w:type="gramEnd"/>
-      <w:r>
-        <w:rPr>
-          <w:rFonts w:ascii="Consolas" w:eastAsia="Times New Roman" w:hAnsi="Consolas" w:cs="Consolas"/>
-          <w:color w:val="6A9955"/>
-          <w:sz w:val="30"/>
-          <w:szCs w:val="30"/>
-          <w:lang w:val="en-US" w:eastAsia="pt-BR"/>
-        </w:rPr>
-        <w:t>// Connect to keypad COL pins</w:t>
+        <w:t xml:space="preserve">   // Connect to keypad COL pins</w:t>
       </w:r>
     </w:p>
     <w:p>
@@ -1782,9 +1514,18 @@
           <w:szCs w:val="30"/>
           <w:lang w:val="en-US" w:eastAsia="pt-BR"/>
         </w:rPr>
-        <w:t xml:space="preserve">Keypad </w:t>
-      </w:r>
-      <w:proofErr w:type="spellStart"/>
+        <w:t xml:space="preserve">Keypad keypad </w:t>
+      </w:r>
+      <w:r>
+        <w:rPr>
+          <w:rFonts w:ascii="Consolas" w:eastAsia="Times New Roman" w:hAnsi="Consolas" w:cs="Consolas"/>
+          <w:color w:val="D4D4D4"/>
+          <w:sz w:val="30"/>
+          <w:szCs w:val="30"/>
+          <w:lang w:val="en-US" w:eastAsia="pt-BR"/>
+        </w:rPr>
+        <w:t>=</w:t>
+      </w:r>
       <w:r>
         <w:rPr>
           <w:rFonts w:ascii="Consolas" w:eastAsia="Times New Roman" w:hAnsi="Consolas" w:cs="Consolas"/>
@@ -1793,9 +1534,18 @@
           <w:szCs w:val="30"/>
           <w:lang w:val="en-US" w:eastAsia="pt-BR"/>
         </w:rPr>
-        <w:t>keypad</w:t>
-      </w:r>
-      <w:proofErr w:type="spellEnd"/>
+        <w:t xml:space="preserve"> </w:t>
+      </w:r>
+      <w:r>
+        <w:rPr>
+          <w:rFonts w:ascii="Consolas" w:eastAsia="Times New Roman" w:hAnsi="Consolas" w:cs="Consolas"/>
+          <w:color w:val="DCDCAA"/>
+          <w:sz w:val="30"/>
+          <w:szCs w:val="30"/>
+          <w:lang w:val="en-US" w:eastAsia="pt-BR"/>
+        </w:rPr>
+        <w:t>Keypad</w:t>
+      </w:r>
       <w:r>
         <w:rPr>
           <w:rFonts w:ascii="Consolas" w:eastAsia="Times New Roman" w:hAnsi="Consolas" w:cs="Consolas"/>
@@ -1804,17 +1554,17 @@
           <w:szCs w:val="30"/>
           <w:lang w:val="en-US" w:eastAsia="pt-BR"/>
         </w:rPr>
-        <w:t xml:space="preserve"> </w:t>
-      </w:r>
-      <w:r>
-        <w:rPr>
-          <w:rFonts w:ascii="Consolas" w:eastAsia="Times New Roman" w:hAnsi="Consolas" w:cs="Consolas"/>
-          <w:color w:val="D4D4D4"/>
-          <w:sz w:val="30"/>
-          <w:szCs w:val="30"/>
-          <w:lang w:val="en-US" w:eastAsia="pt-BR"/>
-        </w:rPr>
-        <w:t>=</w:t>
+        <w:t>(</w:t>
+      </w:r>
+      <w:r>
+        <w:rPr>
+          <w:rFonts w:ascii="Consolas" w:eastAsia="Times New Roman" w:hAnsi="Consolas" w:cs="Consolas"/>
+          <w:color w:val="DCDCAA"/>
+          <w:sz w:val="30"/>
+          <w:szCs w:val="30"/>
+          <w:lang w:val="en-US" w:eastAsia="pt-BR"/>
+        </w:rPr>
+        <w:t>makeKeymap</w:t>
       </w:r>
       <w:r>
         <w:rPr>
@@ -1824,106 +1574,8 @@
           <w:szCs w:val="30"/>
           <w:lang w:val="en-US" w:eastAsia="pt-BR"/>
         </w:rPr>
-        <w:t xml:space="preserve"> </w:t>
-      </w:r>
-      <w:r>
-        <w:rPr>
-          <w:rFonts w:ascii="Consolas" w:eastAsia="Times New Roman" w:hAnsi="Consolas" w:cs="Consolas"/>
-          <w:color w:val="DCDCAA"/>
-          <w:sz w:val="30"/>
-          <w:szCs w:val="30"/>
-          <w:lang w:val="en-US" w:eastAsia="pt-BR"/>
-        </w:rPr>
-        <w:t>Keypad</w:t>
-      </w:r>
-      <w:r>
-        <w:rPr>
-          <w:rFonts w:ascii="Consolas" w:eastAsia="Times New Roman" w:hAnsi="Consolas" w:cs="Consolas"/>
-          <w:color w:val="CCCCCC"/>
-          <w:sz w:val="30"/>
-          <w:szCs w:val="30"/>
-          <w:lang w:val="en-US" w:eastAsia="pt-BR"/>
-        </w:rPr>
-        <w:t>(</w:t>
-      </w:r>
-      <w:proofErr w:type="spellStart"/>
-      <w:r>
-        <w:rPr>
-          <w:rFonts w:ascii="Consolas" w:eastAsia="Times New Roman" w:hAnsi="Consolas" w:cs="Consolas"/>
-          <w:color w:val="DCDCAA"/>
-          <w:sz w:val="30"/>
-          <w:szCs w:val="30"/>
-          <w:lang w:val="en-US" w:eastAsia="pt-BR"/>
-        </w:rPr>
-        <w:t>makeKeymap</w:t>
-      </w:r>
-      <w:proofErr w:type="spellEnd"/>
-      <w:r>
-        <w:rPr>
-          <w:rFonts w:ascii="Consolas" w:eastAsia="Times New Roman" w:hAnsi="Consolas" w:cs="Consolas"/>
-          <w:color w:val="CCCCCC"/>
-          <w:sz w:val="30"/>
-          <w:szCs w:val="30"/>
-          <w:lang w:val="en-US" w:eastAsia="pt-BR"/>
-        </w:rPr>
-        <w:t xml:space="preserve">(keys), </w:t>
-      </w:r>
-      <w:proofErr w:type="spellStart"/>
-      <w:r>
-        <w:rPr>
-          <w:rFonts w:ascii="Consolas" w:eastAsia="Times New Roman" w:hAnsi="Consolas" w:cs="Consolas"/>
-          <w:color w:val="CCCCCC"/>
-          <w:sz w:val="30"/>
-          <w:szCs w:val="30"/>
-          <w:lang w:val="en-US" w:eastAsia="pt-BR"/>
-        </w:rPr>
-        <w:t>rowPins</w:t>
-      </w:r>
-      <w:proofErr w:type="spellEnd"/>
-      <w:r>
-        <w:rPr>
-          <w:rFonts w:ascii="Consolas" w:eastAsia="Times New Roman" w:hAnsi="Consolas" w:cs="Consolas"/>
-          <w:color w:val="CCCCCC"/>
-          <w:sz w:val="30"/>
-          <w:szCs w:val="30"/>
-          <w:lang w:val="en-US" w:eastAsia="pt-BR"/>
-        </w:rPr>
-        <w:t xml:space="preserve">, </w:t>
-      </w:r>
-      <w:proofErr w:type="spellStart"/>
-      <w:r>
-        <w:rPr>
-          <w:rFonts w:ascii="Consolas" w:eastAsia="Times New Roman" w:hAnsi="Consolas" w:cs="Consolas"/>
-          <w:color w:val="CCCCCC"/>
-          <w:sz w:val="30"/>
-          <w:szCs w:val="30"/>
-          <w:lang w:val="en-US" w:eastAsia="pt-BR"/>
-        </w:rPr>
-        <w:t>colPins</w:t>
-      </w:r>
-      <w:proofErr w:type="spellEnd"/>
-      <w:r>
-        <w:rPr>
-          <w:rFonts w:ascii="Consolas" w:eastAsia="Times New Roman" w:hAnsi="Consolas" w:cs="Consolas"/>
-          <w:color w:val="CCCCCC"/>
-          <w:sz w:val="30"/>
-          <w:szCs w:val="30"/>
-          <w:lang w:val="en-US" w:eastAsia="pt-BR"/>
-        </w:rPr>
-        <w:t>, ROWS, COLS</w:t>
-      </w:r>
-      <w:proofErr w:type="gramStart"/>
-      <w:r>
-        <w:rPr>
-          <w:rFonts w:ascii="Consolas" w:eastAsia="Times New Roman" w:hAnsi="Consolas" w:cs="Consolas"/>
-          <w:color w:val="CCCCCC"/>
-          <w:sz w:val="30"/>
-          <w:szCs w:val="30"/>
-          <w:lang w:val="en-US" w:eastAsia="pt-BR"/>
-        </w:rPr>
-        <w:t>);</w:t>
-      </w:r>
-      <w:proofErr w:type="gramEnd"/>
+        <w:t>(keys), rowPins, colPins, ROWS, COLS);</w:t>
+      </w:r>
     </w:p>
     <w:p>
       <w:pPr>
@@ -1991,9 +1643,38 @@
           <w:szCs w:val="30"/>
           <w:lang w:val="en-US" w:eastAsia="pt-BR"/>
         </w:rPr>
+        <w:t xml:space="preserve"> segA </w:t>
+      </w:r>
+      <w:r>
+        <w:rPr>
+          <w:rFonts w:ascii="Consolas" w:eastAsia="Times New Roman" w:hAnsi="Consolas" w:cs="Consolas"/>
+          <w:color w:val="D4D4D4"/>
+          <w:sz w:val="30"/>
+          <w:szCs w:val="30"/>
+          <w:lang w:val="en-US" w:eastAsia="pt-BR"/>
+        </w:rPr>
+        <w:t>=</w:t>
+      </w:r>
+      <w:r>
+        <w:rPr>
+          <w:rFonts w:ascii="Consolas" w:eastAsia="Times New Roman" w:hAnsi="Consolas" w:cs="Consolas"/>
+          <w:color w:val="CCCCCC"/>
+          <w:sz w:val="30"/>
+          <w:szCs w:val="30"/>
+          <w:lang w:val="en-US" w:eastAsia="pt-BR"/>
+        </w:rPr>
         <w:t xml:space="preserve"> </w:t>
       </w:r>
-      <w:proofErr w:type="spellStart"/>
+      <w:r>
+        <w:rPr>
+          <w:rFonts w:ascii="Consolas" w:eastAsia="Times New Roman" w:hAnsi="Consolas" w:cs="Consolas"/>
+          <w:color w:val="B5CEA8"/>
+          <w:sz w:val="30"/>
+          <w:szCs w:val="30"/>
+          <w:lang w:val="en-US" w:eastAsia="pt-BR"/>
+        </w:rPr>
+        <w:t>10</w:t>
+      </w:r>
       <w:r>
         <w:rPr>
           <w:rFonts w:ascii="Consolas" w:eastAsia="Times New Roman" w:hAnsi="Consolas" w:cs="Consolas"/>
@@ -2002,61 +1683,8 @@
           <w:szCs w:val="30"/>
           <w:lang w:val="en-US" w:eastAsia="pt-BR"/>
         </w:rPr>
-        <w:t>segA</w:t>
-      </w:r>
-      <w:proofErr w:type="spellEnd"/>
-      <w:r>
-        <w:rPr>
-          <w:rFonts w:ascii="Consolas" w:eastAsia="Times New Roman" w:hAnsi="Consolas" w:cs="Consolas"/>
-          <w:color w:val="CCCCCC"/>
-          <w:sz w:val="30"/>
-          <w:szCs w:val="30"/>
-          <w:lang w:val="en-US" w:eastAsia="pt-BR"/>
-        </w:rPr>
-        <w:t xml:space="preserve"> </w:t>
-      </w:r>
-      <w:r>
-        <w:rPr>
-          <w:rFonts w:ascii="Consolas" w:eastAsia="Times New Roman" w:hAnsi="Consolas" w:cs="Consolas"/>
-          <w:color w:val="D4D4D4"/>
-          <w:sz w:val="30"/>
-          <w:szCs w:val="30"/>
-          <w:lang w:val="en-US" w:eastAsia="pt-BR"/>
-        </w:rPr>
-        <w:t>=</w:t>
-      </w:r>
-      <w:r>
-        <w:rPr>
-          <w:rFonts w:ascii="Consolas" w:eastAsia="Times New Roman" w:hAnsi="Consolas" w:cs="Consolas"/>
-          <w:color w:val="CCCCCC"/>
-          <w:sz w:val="30"/>
-          <w:szCs w:val="30"/>
-          <w:lang w:val="en-US" w:eastAsia="pt-BR"/>
-        </w:rPr>
-        <w:t xml:space="preserve"> </w:t>
-      </w:r>
-      <w:proofErr w:type="gramStart"/>
-      <w:r>
-        <w:rPr>
-          <w:rFonts w:ascii="Consolas" w:eastAsia="Times New Roman" w:hAnsi="Consolas" w:cs="Consolas"/>
-          <w:color w:val="B5CEA8"/>
-          <w:sz w:val="30"/>
-          <w:szCs w:val="30"/>
-          <w:lang w:val="en-US" w:eastAsia="pt-BR"/>
-        </w:rPr>
-        <w:t>10</w:t>
-      </w:r>
-      <w:r>
-        <w:rPr>
-          <w:rFonts w:ascii="Consolas" w:eastAsia="Times New Roman" w:hAnsi="Consolas" w:cs="Consolas"/>
-          <w:color w:val="CCCCCC"/>
-          <w:sz w:val="30"/>
-          <w:szCs w:val="30"/>
-          <w:lang w:val="en-US" w:eastAsia="pt-BR"/>
-        </w:rPr>
         <w:t>;</w:t>
       </w:r>
-      <w:proofErr w:type="gramEnd"/>
     </w:p>
     <w:p>
       <w:pPr>
@@ -2088,9 +1716,38 @@
           <w:szCs w:val="30"/>
           <w:lang w:val="en-US" w:eastAsia="pt-BR"/>
         </w:rPr>
+        <w:t xml:space="preserve"> segB </w:t>
+      </w:r>
+      <w:r>
+        <w:rPr>
+          <w:rFonts w:ascii="Consolas" w:eastAsia="Times New Roman" w:hAnsi="Consolas" w:cs="Consolas"/>
+          <w:color w:val="D4D4D4"/>
+          <w:sz w:val="30"/>
+          <w:szCs w:val="30"/>
+          <w:lang w:val="en-US" w:eastAsia="pt-BR"/>
+        </w:rPr>
+        <w:t>=</w:t>
+      </w:r>
+      <w:r>
+        <w:rPr>
+          <w:rFonts w:ascii="Consolas" w:eastAsia="Times New Roman" w:hAnsi="Consolas" w:cs="Consolas"/>
+          <w:color w:val="CCCCCC"/>
+          <w:sz w:val="30"/>
+          <w:szCs w:val="30"/>
+          <w:lang w:val="en-US" w:eastAsia="pt-BR"/>
+        </w:rPr>
         <w:t xml:space="preserve"> </w:t>
       </w:r>
-      <w:proofErr w:type="spellStart"/>
+      <w:r>
+        <w:rPr>
+          <w:rFonts w:ascii="Consolas" w:eastAsia="Times New Roman" w:hAnsi="Consolas" w:cs="Consolas"/>
+          <w:color w:val="B5CEA8"/>
+          <w:sz w:val="30"/>
+          <w:szCs w:val="30"/>
+          <w:lang w:val="en-US" w:eastAsia="pt-BR"/>
+        </w:rPr>
+        <w:t>11</w:t>
+      </w:r>
       <w:r>
         <w:rPr>
           <w:rFonts w:ascii="Consolas" w:eastAsia="Times New Roman" w:hAnsi="Consolas" w:cs="Consolas"/>
@@ -2099,61 +1756,8 @@
           <w:szCs w:val="30"/>
           <w:lang w:val="en-US" w:eastAsia="pt-BR"/>
         </w:rPr>
-        <w:t>segB</w:t>
-      </w:r>
-      <w:proofErr w:type="spellEnd"/>
-      <w:r>
-        <w:rPr>
-          <w:rFonts w:ascii="Consolas" w:eastAsia="Times New Roman" w:hAnsi="Consolas" w:cs="Consolas"/>
-          <w:color w:val="CCCCCC"/>
-          <w:sz w:val="30"/>
-          <w:szCs w:val="30"/>
-          <w:lang w:val="en-US" w:eastAsia="pt-BR"/>
-        </w:rPr>
-        <w:t xml:space="preserve"> </w:t>
-      </w:r>
-      <w:r>
-        <w:rPr>
-          <w:rFonts w:ascii="Consolas" w:eastAsia="Times New Roman" w:hAnsi="Consolas" w:cs="Consolas"/>
-          <w:color w:val="D4D4D4"/>
-          <w:sz w:val="30"/>
-          <w:szCs w:val="30"/>
-          <w:lang w:val="en-US" w:eastAsia="pt-BR"/>
-        </w:rPr>
-        <w:t>=</w:t>
-      </w:r>
-      <w:r>
-        <w:rPr>
-          <w:rFonts w:ascii="Consolas" w:eastAsia="Times New Roman" w:hAnsi="Consolas" w:cs="Consolas"/>
-          <w:color w:val="CCCCCC"/>
-          <w:sz w:val="30"/>
-          <w:szCs w:val="30"/>
-          <w:lang w:val="en-US" w:eastAsia="pt-BR"/>
-        </w:rPr>
-        <w:t xml:space="preserve"> </w:t>
-      </w:r>
-      <w:proofErr w:type="gramStart"/>
-      <w:r>
-        <w:rPr>
-          <w:rFonts w:ascii="Consolas" w:eastAsia="Times New Roman" w:hAnsi="Consolas" w:cs="Consolas"/>
-          <w:color w:val="B5CEA8"/>
-          <w:sz w:val="30"/>
-          <w:szCs w:val="30"/>
-          <w:lang w:val="en-US" w:eastAsia="pt-BR"/>
-        </w:rPr>
-        <w:t>11</w:t>
-      </w:r>
-      <w:r>
-        <w:rPr>
-          <w:rFonts w:ascii="Consolas" w:eastAsia="Times New Roman" w:hAnsi="Consolas" w:cs="Consolas"/>
-          <w:color w:val="CCCCCC"/>
-          <w:sz w:val="30"/>
-          <w:szCs w:val="30"/>
-          <w:lang w:val="en-US" w:eastAsia="pt-BR"/>
-        </w:rPr>
         <w:t>;</w:t>
       </w:r>
-      <w:proofErr w:type="gramEnd"/>
     </w:p>
     <w:p>
       <w:pPr>
@@ -2185,9 +1789,38 @@
           <w:szCs w:val="30"/>
           <w:lang w:val="en-US" w:eastAsia="pt-BR"/>
         </w:rPr>
+        <w:t xml:space="preserve"> segC </w:t>
+      </w:r>
+      <w:r>
+        <w:rPr>
+          <w:rFonts w:ascii="Consolas" w:eastAsia="Times New Roman" w:hAnsi="Consolas" w:cs="Consolas"/>
+          <w:color w:val="D4D4D4"/>
+          <w:sz w:val="30"/>
+          <w:szCs w:val="30"/>
+          <w:lang w:val="en-US" w:eastAsia="pt-BR"/>
+        </w:rPr>
+        <w:t>=</w:t>
+      </w:r>
+      <w:r>
+        <w:rPr>
+          <w:rFonts w:ascii="Consolas" w:eastAsia="Times New Roman" w:hAnsi="Consolas" w:cs="Consolas"/>
+          <w:color w:val="CCCCCC"/>
+          <w:sz w:val="30"/>
+          <w:szCs w:val="30"/>
+          <w:lang w:val="en-US" w:eastAsia="pt-BR"/>
+        </w:rPr>
         <w:t xml:space="preserve"> </w:t>
       </w:r>
-      <w:proofErr w:type="spellStart"/>
+      <w:r>
+        <w:rPr>
+          <w:rFonts w:ascii="Consolas" w:eastAsia="Times New Roman" w:hAnsi="Consolas" w:cs="Consolas"/>
+          <w:color w:val="B5CEA8"/>
+          <w:sz w:val="30"/>
+          <w:szCs w:val="30"/>
+          <w:lang w:val="en-US" w:eastAsia="pt-BR"/>
+        </w:rPr>
+        <w:t>12</w:t>
+      </w:r>
       <w:r>
         <w:rPr>
           <w:rFonts w:ascii="Consolas" w:eastAsia="Times New Roman" w:hAnsi="Consolas" w:cs="Consolas"/>
@@ -2196,61 +1829,8 @@
           <w:szCs w:val="30"/>
           <w:lang w:val="en-US" w:eastAsia="pt-BR"/>
         </w:rPr>
-        <w:t>segC</w:t>
-      </w:r>
-      <w:proofErr w:type="spellEnd"/>
-      <w:r>
-        <w:rPr>
-          <w:rFonts w:ascii="Consolas" w:eastAsia="Times New Roman" w:hAnsi="Consolas" w:cs="Consolas"/>
-          <w:color w:val="CCCCCC"/>
-          <w:sz w:val="30"/>
-          <w:szCs w:val="30"/>
-          <w:lang w:val="en-US" w:eastAsia="pt-BR"/>
-        </w:rPr>
-        <w:t xml:space="preserve"> </w:t>
-      </w:r>
-      <w:r>
-        <w:rPr>
-          <w:rFonts w:ascii="Consolas" w:eastAsia="Times New Roman" w:hAnsi="Consolas" w:cs="Consolas"/>
-          <w:color w:val="D4D4D4"/>
-          <w:sz w:val="30"/>
-          <w:szCs w:val="30"/>
-          <w:lang w:val="en-US" w:eastAsia="pt-BR"/>
-        </w:rPr>
-        <w:t>=</w:t>
-      </w:r>
-      <w:r>
-        <w:rPr>
-          <w:rFonts w:ascii="Consolas" w:eastAsia="Times New Roman" w:hAnsi="Consolas" w:cs="Consolas"/>
-          <w:color w:val="CCCCCC"/>
-          <w:sz w:val="30"/>
-          <w:szCs w:val="30"/>
-          <w:lang w:val="en-US" w:eastAsia="pt-BR"/>
-        </w:rPr>
-        <w:t xml:space="preserve"> </w:t>
-      </w:r>
-      <w:proofErr w:type="gramStart"/>
-      <w:r>
-        <w:rPr>
-          <w:rFonts w:ascii="Consolas" w:eastAsia="Times New Roman" w:hAnsi="Consolas" w:cs="Consolas"/>
-          <w:color w:val="B5CEA8"/>
-          <w:sz w:val="30"/>
-          <w:szCs w:val="30"/>
-          <w:lang w:val="en-US" w:eastAsia="pt-BR"/>
-        </w:rPr>
-        <w:t>12</w:t>
-      </w:r>
-      <w:r>
-        <w:rPr>
-          <w:rFonts w:ascii="Consolas" w:eastAsia="Times New Roman" w:hAnsi="Consolas" w:cs="Consolas"/>
-          <w:color w:val="CCCCCC"/>
-          <w:sz w:val="30"/>
-          <w:szCs w:val="30"/>
-          <w:lang w:val="en-US" w:eastAsia="pt-BR"/>
-        </w:rPr>
         <w:t>;</w:t>
       </w:r>
-      <w:proofErr w:type="gramEnd"/>
     </w:p>
     <w:p>
       <w:pPr>
@@ -2282,9 +1862,18 @@
           <w:szCs w:val="30"/>
           <w:lang w:val="en-US" w:eastAsia="pt-BR"/>
         </w:rPr>
-        <w:t xml:space="preserve"> </w:t>
-      </w:r>
-      <w:proofErr w:type="spellStart"/>
+        <w:t xml:space="preserve"> segD </w:t>
+      </w:r>
+      <w:r>
+        <w:rPr>
+          <w:rFonts w:ascii="Consolas" w:eastAsia="Times New Roman" w:hAnsi="Consolas" w:cs="Consolas"/>
+          <w:color w:val="D4D4D4"/>
+          <w:sz w:val="30"/>
+          <w:szCs w:val="30"/>
+          <w:lang w:val="en-US" w:eastAsia="pt-BR"/>
+        </w:rPr>
+        <w:t>=</w:t>
+      </w:r>
       <w:r>
         <w:rPr>
           <w:rFonts w:ascii="Consolas" w:eastAsia="Times New Roman" w:hAnsi="Consolas" w:cs="Consolas"/>
@@ -2293,51 +1882,8 @@
           <w:szCs w:val="30"/>
           <w:lang w:val="en-US" w:eastAsia="pt-BR"/>
         </w:rPr>
-        <w:t>segD</w:t>
-      </w:r>
-      <w:proofErr w:type="spellEnd"/>
-      <w:r>
-        <w:rPr>
-          <w:rFonts w:ascii="Consolas" w:eastAsia="Times New Roman" w:hAnsi="Consolas" w:cs="Consolas"/>
-          <w:color w:val="CCCCCC"/>
-          <w:sz w:val="30"/>
-          <w:szCs w:val="30"/>
-          <w:lang w:val="en-US" w:eastAsia="pt-BR"/>
-        </w:rPr>
-        <w:t xml:space="preserve"> </w:t>
-      </w:r>
-      <w:r>
-        <w:rPr>
-          <w:rFonts w:ascii="Consolas" w:eastAsia="Times New Roman" w:hAnsi="Consolas" w:cs="Consolas"/>
-          <w:color w:val="D4D4D4"/>
-          <w:sz w:val="30"/>
-          <w:szCs w:val="30"/>
-          <w:lang w:val="en-US" w:eastAsia="pt-BR"/>
-        </w:rPr>
-        <w:t>=</w:t>
-      </w:r>
-      <w:r>
-        <w:rPr>
-          <w:rFonts w:ascii="Consolas" w:eastAsia="Times New Roman" w:hAnsi="Consolas" w:cs="Consolas"/>
-          <w:color w:val="CCCCCC"/>
-          <w:sz w:val="30"/>
-          <w:szCs w:val="30"/>
-          <w:lang w:val="en-US" w:eastAsia="pt-BR"/>
-        </w:rPr>
-        <w:t xml:space="preserve"> </w:t>
-      </w:r>
-      <w:proofErr w:type="gramStart"/>
-      <w:r>
-        <w:rPr>
-          <w:rFonts w:ascii="Consolas" w:eastAsia="Times New Roman" w:hAnsi="Consolas" w:cs="Consolas"/>
-          <w:color w:val="CCCCCC"/>
-          <w:sz w:val="30"/>
-          <w:szCs w:val="30"/>
-          <w:lang w:val="en-US" w:eastAsia="pt-BR"/>
-        </w:rPr>
-        <w:t>A0;</w:t>
-      </w:r>
-      <w:proofErr w:type="gramEnd"/>
+        <w:t xml:space="preserve"> A0;</w:t>
+      </w:r>
     </w:p>
     <w:p>
       <w:pPr>
@@ -2369,9 +1915,18 @@
           <w:szCs w:val="30"/>
           <w:lang w:val="en-US" w:eastAsia="pt-BR"/>
         </w:rPr>
-        <w:t xml:space="preserve"> </w:t>
-      </w:r>
-      <w:proofErr w:type="spellStart"/>
+        <w:t xml:space="preserve"> segE </w:t>
+      </w:r>
+      <w:r>
+        <w:rPr>
+          <w:rFonts w:ascii="Consolas" w:eastAsia="Times New Roman" w:hAnsi="Consolas" w:cs="Consolas"/>
+          <w:color w:val="D4D4D4"/>
+          <w:sz w:val="30"/>
+          <w:szCs w:val="30"/>
+          <w:lang w:val="en-US" w:eastAsia="pt-BR"/>
+        </w:rPr>
+        <w:t>=</w:t>
+      </w:r>
       <w:r>
         <w:rPr>
           <w:rFonts w:ascii="Consolas" w:eastAsia="Times New Roman" w:hAnsi="Consolas" w:cs="Consolas"/>
@@ -2380,51 +1935,8 @@
           <w:szCs w:val="30"/>
           <w:lang w:val="en-US" w:eastAsia="pt-BR"/>
         </w:rPr>
-        <w:t>segE</w:t>
-      </w:r>
-      <w:proofErr w:type="spellEnd"/>
-      <w:r>
-        <w:rPr>
-          <w:rFonts w:ascii="Consolas" w:eastAsia="Times New Roman" w:hAnsi="Consolas" w:cs="Consolas"/>
-          <w:color w:val="CCCCCC"/>
-          <w:sz w:val="30"/>
-          <w:szCs w:val="30"/>
-          <w:lang w:val="en-US" w:eastAsia="pt-BR"/>
-        </w:rPr>
-        <w:t xml:space="preserve"> </w:t>
-      </w:r>
-      <w:r>
-        <w:rPr>
-          <w:rFonts w:ascii="Consolas" w:eastAsia="Times New Roman" w:hAnsi="Consolas" w:cs="Consolas"/>
-          <w:color w:val="D4D4D4"/>
-          <w:sz w:val="30"/>
-          <w:szCs w:val="30"/>
-          <w:lang w:val="en-US" w:eastAsia="pt-BR"/>
-        </w:rPr>
-        <w:t>=</w:t>
-      </w:r>
-      <w:r>
-        <w:rPr>
-          <w:rFonts w:ascii="Consolas" w:eastAsia="Times New Roman" w:hAnsi="Consolas" w:cs="Consolas"/>
-          <w:color w:val="CCCCCC"/>
-          <w:sz w:val="30"/>
-          <w:szCs w:val="30"/>
-          <w:lang w:val="en-US" w:eastAsia="pt-BR"/>
-        </w:rPr>
-        <w:t xml:space="preserve"> </w:t>
-      </w:r>
-      <w:proofErr w:type="gramStart"/>
-      <w:r>
-        <w:rPr>
-          <w:rFonts w:ascii="Consolas" w:eastAsia="Times New Roman" w:hAnsi="Consolas" w:cs="Consolas"/>
-          <w:color w:val="CCCCCC"/>
-          <w:sz w:val="30"/>
-          <w:szCs w:val="30"/>
-          <w:lang w:val="en-US" w:eastAsia="pt-BR"/>
-        </w:rPr>
-        <w:t>A1;</w:t>
-      </w:r>
-      <w:proofErr w:type="gramEnd"/>
+        <w:t xml:space="preserve"> A1;</w:t>
+      </w:r>
     </w:p>
     <w:p>
       <w:pPr>
@@ -2456,9 +1968,18 @@
           <w:szCs w:val="30"/>
           <w:lang w:val="en-US" w:eastAsia="pt-BR"/>
         </w:rPr>
-        <w:t xml:space="preserve"> </w:t>
-      </w:r>
-      <w:proofErr w:type="spellStart"/>
+        <w:t xml:space="preserve"> segF </w:t>
+      </w:r>
+      <w:r>
+        <w:rPr>
+          <w:rFonts w:ascii="Consolas" w:eastAsia="Times New Roman" w:hAnsi="Consolas" w:cs="Consolas"/>
+          <w:color w:val="D4D4D4"/>
+          <w:sz w:val="30"/>
+          <w:szCs w:val="30"/>
+          <w:lang w:val="en-US" w:eastAsia="pt-BR"/>
+        </w:rPr>
+        <w:t>=</w:t>
+      </w:r>
       <w:r>
         <w:rPr>
           <w:rFonts w:ascii="Consolas" w:eastAsia="Times New Roman" w:hAnsi="Consolas" w:cs="Consolas"/>
@@ -2467,51 +1988,8 @@
           <w:szCs w:val="30"/>
           <w:lang w:val="en-US" w:eastAsia="pt-BR"/>
         </w:rPr>
-        <w:t>segF</w:t>
-      </w:r>
-      <w:proofErr w:type="spellEnd"/>
-      <w:r>
-        <w:rPr>
-          <w:rFonts w:ascii="Consolas" w:eastAsia="Times New Roman" w:hAnsi="Consolas" w:cs="Consolas"/>
-          <w:color w:val="CCCCCC"/>
-          <w:sz w:val="30"/>
-          <w:szCs w:val="30"/>
-          <w:lang w:val="en-US" w:eastAsia="pt-BR"/>
-        </w:rPr>
-        <w:t xml:space="preserve"> </w:t>
-      </w:r>
-      <w:r>
-        <w:rPr>
-          <w:rFonts w:ascii="Consolas" w:eastAsia="Times New Roman" w:hAnsi="Consolas" w:cs="Consolas"/>
-          <w:color w:val="D4D4D4"/>
-          <w:sz w:val="30"/>
-          <w:szCs w:val="30"/>
-          <w:lang w:val="en-US" w:eastAsia="pt-BR"/>
-        </w:rPr>
-        <w:t>=</w:t>
-      </w:r>
-      <w:r>
-        <w:rPr>
-          <w:rFonts w:ascii="Consolas" w:eastAsia="Times New Roman" w:hAnsi="Consolas" w:cs="Consolas"/>
-          <w:color w:val="CCCCCC"/>
-          <w:sz w:val="30"/>
-          <w:szCs w:val="30"/>
-          <w:lang w:val="en-US" w:eastAsia="pt-BR"/>
-        </w:rPr>
-        <w:t xml:space="preserve"> </w:t>
-      </w:r>
-      <w:proofErr w:type="gramStart"/>
-      <w:r>
-        <w:rPr>
-          <w:rFonts w:ascii="Consolas" w:eastAsia="Times New Roman" w:hAnsi="Consolas" w:cs="Consolas"/>
-          <w:color w:val="CCCCCC"/>
-          <w:sz w:val="30"/>
-          <w:szCs w:val="30"/>
-          <w:lang w:val="en-US" w:eastAsia="pt-BR"/>
-        </w:rPr>
-        <w:t>A2;</w:t>
-      </w:r>
-      <w:proofErr w:type="gramEnd"/>
+        <w:t xml:space="preserve"> A2;</w:t>
+      </w:r>
     </w:p>
     <w:p>
       <w:pPr>
@@ -2543,9 +2021,18 @@
           <w:szCs w:val="30"/>
           <w:lang w:val="en-US" w:eastAsia="pt-BR"/>
         </w:rPr>
-        <w:t xml:space="preserve"> </w:t>
-      </w:r>
-      <w:proofErr w:type="spellStart"/>
+        <w:t xml:space="preserve"> segG </w:t>
+      </w:r>
+      <w:r>
+        <w:rPr>
+          <w:rFonts w:ascii="Consolas" w:eastAsia="Times New Roman" w:hAnsi="Consolas" w:cs="Consolas"/>
+          <w:color w:val="D4D4D4"/>
+          <w:sz w:val="30"/>
+          <w:szCs w:val="30"/>
+          <w:lang w:val="en-US" w:eastAsia="pt-BR"/>
+        </w:rPr>
+        <w:t>=</w:t>
+      </w:r>
       <w:r>
         <w:rPr>
           <w:rFonts w:ascii="Consolas" w:eastAsia="Times New Roman" w:hAnsi="Consolas" w:cs="Consolas"/>
@@ -2554,51 +2041,8 @@
           <w:szCs w:val="30"/>
           <w:lang w:val="en-US" w:eastAsia="pt-BR"/>
         </w:rPr>
-        <w:t>segG</w:t>
-      </w:r>
-      <w:proofErr w:type="spellEnd"/>
-      <w:r>
-        <w:rPr>
-          <w:rFonts w:ascii="Consolas" w:eastAsia="Times New Roman" w:hAnsi="Consolas" w:cs="Consolas"/>
-          <w:color w:val="CCCCCC"/>
-          <w:sz w:val="30"/>
-          <w:szCs w:val="30"/>
-          <w:lang w:val="en-US" w:eastAsia="pt-BR"/>
-        </w:rPr>
-        <w:t xml:space="preserve"> </w:t>
-      </w:r>
-      <w:r>
-        <w:rPr>
-          <w:rFonts w:ascii="Consolas" w:eastAsia="Times New Roman" w:hAnsi="Consolas" w:cs="Consolas"/>
-          <w:color w:val="D4D4D4"/>
-          <w:sz w:val="30"/>
-          <w:szCs w:val="30"/>
-          <w:lang w:val="en-US" w:eastAsia="pt-BR"/>
-        </w:rPr>
-        <w:t>=</w:t>
-      </w:r>
-      <w:r>
-        <w:rPr>
-          <w:rFonts w:ascii="Consolas" w:eastAsia="Times New Roman" w:hAnsi="Consolas" w:cs="Consolas"/>
-          <w:color w:val="CCCCCC"/>
-          <w:sz w:val="30"/>
-          <w:szCs w:val="30"/>
-          <w:lang w:val="en-US" w:eastAsia="pt-BR"/>
-        </w:rPr>
-        <w:t xml:space="preserve"> </w:t>
-      </w:r>
-      <w:proofErr w:type="gramStart"/>
-      <w:r>
-        <w:rPr>
-          <w:rFonts w:ascii="Consolas" w:eastAsia="Times New Roman" w:hAnsi="Consolas" w:cs="Consolas"/>
-          <w:color w:val="CCCCCC"/>
-          <w:sz w:val="30"/>
-          <w:szCs w:val="30"/>
-          <w:lang w:val="en-US" w:eastAsia="pt-BR"/>
-        </w:rPr>
-        <w:t>A3;</w:t>
-      </w:r>
-      <w:proofErr w:type="gramEnd"/>
+        <w:t xml:space="preserve"> A3;</w:t>
+      </w:r>
     </w:p>
     <w:p>
       <w:pPr>
@@ -2681,7 +2125,6 @@
         </w:rPr>
         <w:t xml:space="preserve">byte </w:t>
       </w:r>
-      <w:proofErr w:type="gramStart"/>
       <w:r>
         <w:rPr>
           <w:rFonts w:ascii="Consolas" w:eastAsia="Times New Roman" w:hAnsi="Consolas" w:cs="Consolas"/>
@@ -2702,7 +2145,6 @@
         </w:rPr>
         <w:t>[</w:t>
       </w:r>
-      <w:proofErr w:type="gramEnd"/>
       <w:r>
         <w:rPr>
           <w:rFonts w:ascii="Consolas" w:eastAsia="Times New Roman" w:hAnsi="Consolas" w:cs="Consolas"/>
@@ -2906,7 +2348,6 @@
         </w:rPr>
         <w:t>,</w:t>
       </w:r>
-      <w:proofErr w:type="gramStart"/>
       <w:r>
         <w:rPr>
           <w:rFonts w:ascii="Consolas" w:eastAsia="Times New Roman" w:hAnsi="Consolas" w:cs="Consolas"/>
@@ -2927,7 +2368,6 @@
         </w:rPr>
         <w:t>},</w:t>
       </w:r>
-      <w:proofErr w:type="gramEnd"/>
       <w:r>
         <w:rPr>
           <w:rFonts w:ascii="Consolas" w:eastAsia="Times New Roman" w:hAnsi="Consolas" w:cs="Consolas"/>
@@ -3081,7 +2521,6 @@
         </w:rPr>
         <w:t>,</w:t>
       </w:r>
-      <w:proofErr w:type="gramStart"/>
       <w:r>
         <w:rPr>
           <w:rFonts w:ascii="Consolas" w:eastAsia="Times New Roman" w:hAnsi="Consolas" w:cs="Consolas"/>
@@ -3102,7 +2541,6 @@
         </w:rPr>
         <w:t>},</w:t>
       </w:r>
-      <w:proofErr w:type="gramEnd"/>
       <w:r>
         <w:rPr>
           <w:rFonts w:ascii="Consolas" w:eastAsia="Times New Roman" w:hAnsi="Consolas" w:cs="Consolas"/>
@@ -3216,7 +2654,6 @@
         </w:rPr>
         <w:t>,</w:t>
       </w:r>
-      <w:proofErr w:type="gramStart"/>
       <w:r>
         <w:rPr>
           <w:rFonts w:ascii="Consolas" w:eastAsia="Times New Roman" w:hAnsi="Consolas" w:cs="Consolas"/>
@@ -3275,18 +2712,7 @@
           <w:szCs w:val="30"/>
           <w:lang w:val="en-US" w:eastAsia="pt-BR"/>
         </w:rPr>
-        <w:t>}</w:t>
-      </w:r>
-      <w:proofErr w:type="gramEnd"/>
-      <w:r>
-        <w:rPr>
-          <w:rFonts w:ascii="Consolas" w:eastAsia="Times New Roman" w:hAnsi="Consolas" w:cs="Consolas"/>
-          <w:color w:val="CCCCCC"/>
-          <w:sz w:val="30"/>
-          <w:szCs w:val="30"/>
-          <w:lang w:val="en-US" w:eastAsia="pt-BR"/>
-        </w:rPr>
-        <w:t>,</w:t>
+        <w:t>},</w:t>
       </w:r>
       <w:r>
         <w:rPr>
@@ -3441,7 +2867,6 @@
         </w:rPr>
         <w:t>,</w:t>
       </w:r>
-      <w:proofErr w:type="gramStart"/>
       <w:r>
         <w:rPr>
           <w:rFonts w:ascii="Consolas" w:eastAsia="Times New Roman" w:hAnsi="Consolas" w:cs="Consolas"/>
@@ -3462,7 +2887,6 @@
         </w:rPr>
         <w:t>},</w:t>
       </w:r>
-      <w:proofErr w:type="gramEnd"/>
       <w:r>
         <w:rPr>
           <w:rFonts w:ascii="Consolas" w:eastAsia="Times New Roman" w:hAnsi="Consolas" w:cs="Consolas"/>
@@ -3616,7 +3040,6 @@
         </w:rPr>
         <w:t>,</w:t>
       </w:r>
-      <w:proofErr w:type="gramStart"/>
       <w:r>
         <w:rPr>
           <w:rFonts w:ascii="Consolas" w:eastAsia="Times New Roman" w:hAnsi="Consolas" w:cs="Consolas"/>
@@ -3637,7 +3060,6 @@
         </w:rPr>
         <w:t>},</w:t>
       </w:r>
-      <w:proofErr w:type="gramEnd"/>
       <w:r>
         <w:rPr>
           <w:rFonts w:ascii="Consolas" w:eastAsia="Times New Roman" w:hAnsi="Consolas" w:cs="Consolas"/>
@@ -3791,7 +3213,6 @@
         </w:rPr>
         <w:t>,</w:t>
       </w:r>
-      <w:proofErr w:type="gramStart"/>
       <w:r>
         <w:rPr>
           <w:rFonts w:ascii="Consolas" w:eastAsia="Times New Roman" w:hAnsi="Consolas" w:cs="Consolas"/>
@@ -3812,7 +3233,6 @@
         </w:rPr>
         <w:t>},</w:t>
       </w:r>
-      <w:proofErr w:type="gramEnd"/>
       <w:r>
         <w:rPr>
           <w:rFonts w:ascii="Consolas" w:eastAsia="Times New Roman" w:hAnsi="Consolas" w:cs="Consolas"/>
@@ -3966,7 +3386,6 @@
         </w:rPr>
         <w:t>,</w:t>
       </w:r>
-      <w:proofErr w:type="gramStart"/>
       <w:r>
         <w:rPr>
           <w:rFonts w:ascii="Consolas" w:eastAsia="Times New Roman" w:hAnsi="Consolas" w:cs="Consolas"/>
@@ -3987,7 +3406,6 @@
         </w:rPr>
         <w:t>},</w:t>
       </w:r>
-      <w:proofErr w:type="gramEnd"/>
       <w:r>
         <w:rPr>
           <w:rFonts w:ascii="Consolas" w:eastAsia="Times New Roman" w:hAnsi="Consolas" w:cs="Consolas"/>
@@ -4141,7 +3559,6 @@
         </w:rPr>
         <w:t>,</w:t>
       </w:r>
-      <w:proofErr w:type="gramStart"/>
       <w:r>
         <w:rPr>
           <w:rFonts w:ascii="Consolas" w:eastAsia="Times New Roman" w:hAnsi="Consolas" w:cs="Consolas"/>
@@ -4162,7 +3579,6 @@
         </w:rPr>
         <w:t>},</w:t>
       </w:r>
-      <w:proofErr w:type="gramEnd"/>
       <w:r>
         <w:rPr>
           <w:rFonts w:ascii="Consolas" w:eastAsia="Times New Roman" w:hAnsi="Consolas" w:cs="Consolas"/>
@@ -4316,7 +3732,6 @@
         </w:rPr>
         <w:t>,</w:t>
       </w:r>
-      <w:proofErr w:type="gramStart"/>
       <w:r>
         <w:rPr>
           <w:rFonts w:ascii="Consolas" w:eastAsia="Times New Roman" w:hAnsi="Consolas" w:cs="Consolas"/>
@@ -4337,7 +3752,6 @@
         </w:rPr>
         <w:t>},</w:t>
       </w:r>
-      <w:proofErr w:type="gramEnd"/>
       <w:r>
         <w:rPr>
           <w:rFonts w:ascii="Consolas" w:eastAsia="Times New Roman" w:hAnsi="Consolas" w:cs="Consolas"/>
@@ -4501,7 +3915,6 @@
         </w:rPr>
         <w:t>1</w:t>
       </w:r>
-      <w:proofErr w:type="gramStart"/>
       <w:r>
         <w:rPr>
           <w:rFonts w:ascii="Consolas" w:eastAsia="Times New Roman" w:hAnsi="Consolas" w:cs="Consolas"/>
@@ -4520,18 +3933,7 @@
           <w:szCs w:val="30"/>
           <w:lang w:val="en-US" w:eastAsia="pt-BR"/>
         </w:rPr>
-        <w:t xml:space="preserve">  /</w:t>
-      </w:r>
-      <w:proofErr w:type="gramEnd"/>
-      <w:r>
-        <w:rPr>
-          <w:rFonts w:ascii="Consolas" w:eastAsia="Times New Roman" w:hAnsi="Consolas" w:cs="Consolas"/>
-          <w:color w:val="6A9955"/>
-          <w:sz w:val="30"/>
-          <w:szCs w:val="30"/>
-          <w:lang w:val="en-US" w:eastAsia="pt-BR"/>
-        </w:rPr>
-        <w:t>/ 9</w:t>
+        <w:t xml:space="preserve">  // 9</w:t>
       </w:r>
     </w:p>
     <w:p>
@@ -4546,7 +3948,6 @@
           <w:lang w:val="en-US" w:eastAsia="pt-BR"/>
         </w:rPr>
       </w:pPr>
-      <w:proofErr w:type="gramStart"/>
       <w:r>
         <w:rPr>
           <w:rFonts w:ascii="Consolas" w:eastAsia="Times New Roman" w:hAnsi="Consolas" w:cs="Consolas"/>
@@ -4557,7 +3958,6 @@
         </w:rPr>
         <w:t>};</w:t>
       </w:r>
-      <w:proofErr w:type="gramEnd"/>
     </w:p>
     <w:p>
       <w:pPr>
@@ -4604,8 +4004,6 @@
         </w:rPr>
         <w:t xml:space="preserve"> </w:t>
       </w:r>
-      <w:proofErr w:type="spellStart"/>
-      <w:proofErr w:type="gramStart"/>
       <w:r>
         <w:rPr>
           <w:rFonts w:ascii="Consolas" w:eastAsia="Times New Roman" w:hAnsi="Consolas" w:cs="Consolas"/>
@@ -4616,7 +4014,6 @@
         </w:rPr>
         <w:t>segmentPins</w:t>
       </w:r>
-      <w:proofErr w:type="spellEnd"/>
       <w:r>
         <w:rPr>
           <w:rFonts w:ascii="Consolas" w:eastAsia="Times New Roman" w:hAnsi="Consolas" w:cs="Consolas"/>
@@ -4627,7 +4024,6 @@
         </w:rPr>
         <w:t>[</w:t>
       </w:r>
-      <w:proofErr w:type="gramEnd"/>
       <w:r>
         <w:rPr>
           <w:rFonts w:ascii="Consolas" w:eastAsia="Times New Roman" w:hAnsi="Consolas" w:cs="Consolas"/>
@@ -4666,164 +4062,8 @@
           <w:szCs w:val="30"/>
           <w:lang w:val="en-US" w:eastAsia="pt-BR"/>
         </w:rPr>
-        <w:t xml:space="preserve"> {</w:t>
-      </w:r>
-      <w:proofErr w:type="spellStart"/>
-      <w:r>
-        <w:rPr>
-          <w:rFonts w:ascii="Consolas" w:eastAsia="Times New Roman" w:hAnsi="Consolas" w:cs="Consolas"/>
-          <w:color w:val="CCCCCC"/>
-          <w:sz w:val="30"/>
-          <w:szCs w:val="30"/>
-          <w:lang w:val="en-US" w:eastAsia="pt-BR"/>
-        </w:rPr>
-        <w:t>segA</w:t>
-      </w:r>
-      <w:proofErr w:type="spellEnd"/>
-      <w:r>
-        <w:rPr>
-          <w:rFonts w:ascii="Consolas" w:eastAsia="Times New Roman" w:hAnsi="Consolas" w:cs="Consolas"/>
-          <w:color w:val="CCCCCC"/>
-          <w:sz w:val="30"/>
-          <w:szCs w:val="30"/>
-          <w:lang w:val="en-US" w:eastAsia="pt-BR"/>
-        </w:rPr>
-        <w:t xml:space="preserve">, </w:t>
-      </w:r>
-      <w:proofErr w:type="spellStart"/>
-      <w:r>
-        <w:rPr>
-          <w:rFonts w:ascii="Consolas" w:eastAsia="Times New Roman" w:hAnsi="Consolas" w:cs="Consolas"/>
-          <w:color w:val="CCCCCC"/>
-          <w:sz w:val="30"/>
-          <w:szCs w:val="30"/>
-          <w:lang w:val="en-US" w:eastAsia="pt-BR"/>
-        </w:rPr>
-        <w:t>segB</w:t>
-      </w:r>
-      <w:proofErr w:type="spellEnd"/>
-      <w:r>
-        <w:rPr>
-          <w:rFonts w:ascii="Consolas" w:eastAsia="Times New Roman" w:hAnsi="Consolas" w:cs="Consolas"/>
-          <w:color w:val="CCCCCC"/>
-          <w:sz w:val="30"/>
-          <w:szCs w:val="30"/>
-          <w:lang w:val="en-US" w:eastAsia="pt-BR"/>
-        </w:rPr>
-        <w:t xml:space="preserve">, </w:t>
-      </w:r>
-      <w:proofErr w:type="spellStart"/>
-      <w:r>
-        <w:rPr>
-          <w:rFonts w:ascii="Consolas" w:eastAsia="Times New Roman" w:hAnsi="Consolas" w:cs="Consolas"/>
-          <w:color w:val="CCCCCC"/>
-          <w:sz w:val="30"/>
-          <w:szCs w:val="30"/>
-          <w:lang w:val="en-US" w:eastAsia="pt-BR"/>
-        </w:rPr>
-        <w:t>segC</w:t>
-      </w:r>
-      <w:proofErr w:type="spellEnd"/>
-      <w:r>
-        <w:rPr>
-          <w:rFonts w:ascii="Consolas" w:eastAsia="Times New Roman" w:hAnsi="Consolas" w:cs="Consolas"/>
-          <w:color w:val="CCCCCC"/>
-          <w:sz w:val="30"/>
-          <w:szCs w:val="30"/>
-          <w:lang w:val="en-US" w:eastAsia="pt-BR"/>
-        </w:rPr>
-        <w:t xml:space="preserve">, </w:t>
-      </w:r>
-      <w:proofErr w:type="spellStart"/>
-      <w:r>
-        <w:rPr>
-          <w:rFonts w:ascii="Consolas" w:eastAsia="Times New Roman" w:hAnsi="Consolas" w:cs="Consolas"/>
-          <w:color w:val="CCCCCC"/>
-          <w:sz w:val="30"/>
-          <w:szCs w:val="30"/>
-          <w:lang w:val="en-US" w:eastAsia="pt-BR"/>
-        </w:rPr>
-        <w:t>segD</w:t>
-      </w:r>
-      <w:proofErr w:type="spellEnd"/>
-      <w:r>
-        <w:rPr>
-          <w:rFonts w:ascii="Consolas" w:eastAsia="Times New Roman" w:hAnsi="Consolas" w:cs="Consolas"/>
-          <w:color w:val="CCCCCC"/>
-          <w:sz w:val="30"/>
-          <w:szCs w:val="30"/>
-          <w:lang w:val="en-US" w:eastAsia="pt-BR"/>
-        </w:rPr>
-        <w:t xml:space="preserve">, </w:t>
-      </w:r>
-      <w:proofErr w:type="spellStart"/>
-      <w:r>
-        <w:rPr>
-          <w:rFonts w:ascii="Consolas" w:eastAsia="Times New Roman" w:hAnsi="Consolas" w:cs="Consolas"/>
-          <w:color w:val="CCCCCC"/>
-          <w:sz w:val="30"/>
-          <w:szCs w:val="30"/>
-          <w:lang w:val="en-US" w:eastAsia="pt-BR"/>
-        </w:rPr>
-        <w:t>segE</w:t>
-      </w:r>
-      <w:proofErr w:type="spellEnd"/>
-      <w:r>
-        <w:rPr>
-          <w:rFonts w:ascii="Consolas" w:eastAsia="Times New Roman" w:hAnsi="Consolas" w:cs="Consolas"/>
-          <w:color w:val="CCCCCC"/>
-          <w:sz w:val="30"/>
-          <w:szCs w:val="30"/>
-          <w:lang w:val="en-US" w:eastAsia="pt-BR"/>
-        </w:rPr>
-        <w:t xml:space="preserve">, </w:t>
-      </w:r>
-      <w:proofErr w:type="spellStart"/>
-      <w:r>
-        <w:rPr>
-          <w:rFonts w:ascii="Consolas" w:eastAsia="Times New Roman" w:hAnsi="Consolas" w:cs="Consolas"/>
-          <w:color w:val="CCCCCC"/>
-          <w:sz w:val="30"/>
-          <w:szCs w:val="30"/>
-          <w:lang w:val="en-US" w:eastAsia="pt-BR"/>
-        </w:rPr>
-        <w:t>segF</w:t>
-      </w:r>
-      <w:proofErr w:type="spellEnd"/>
-      <w:r>
-        <w:rPr>
-          <w:rFonts w:ascii="Consolas" w:eastAsia="Times New Roman" w:hAnsi="Consolas" w:cs="Consolas"/>
-          <w:color w:val="CCCCCC"/>
-          <w:sz w:val="30"/>
-          <w:szCs w:val="30"/>
-          <w:lang w:val="en-US" w:eastAsia="pt-BR"/>
-        </w:rPr>
-        <w:t xml:space="preserve">, </w:t>
-      </w:r>
-      <w:proofErr w:type="spellStart"/>
-      <w:r>
-        <w:rPr>
-          <w:rFonts w:ascii="Consolas" w:eastAsia="Times New Roman" w:hAnsi="Consolas" w:cs="Consolas"/>
-          <w:color w:val="CCCCCC"/>
-          <w:sz w:val="30"/>
-          <w:szCs w:val="30"/>
-          <w:lang w:val="en-US" w:eastAsia="pt-BR"/>
-        </w:rPr>
-        <w:t>segG</w:t>
-      </w:r>
-      <w:proofErr w:type="spellEnd"/>
-      <w:proofErr w:type="gramStart"/>
-      <w:r>
-        <w:rPr>
-          <w:rFonts w:ascii="Consolas" w:eastAsia="Times New Roman" w:hAnsi="Consolas" w:cs="Consolas"/>
-          <w:color w:val="CCCCCC"/>
-          <w:sz w:val="30"/>
-          <w:szCs w:val="30"/>
-          <w:lang w:val="en-US" w:eastAsia="pt-BR"/>
-        </w:rPr>
-        <w:t>};</w:t>
-      </w:r>
-      <w:proofErr w:type="gramEnd"/>
+        <w:t xml:space="preserve"> {segA, segB, segC, segD, segE, segF, segG};</w:t>
+      </w:r>
     </w:p>
     <w:p>
       <w:pPr>
@@ -4870,7 +4110,6 @@
         </w:rPr>
         <w:t xml:space="preserve"> </w:t>
       </w:r>
-      <w:proofErr w:type="gramStart"/>
       <w:r>
         <w:rPr>
           <w:rFonts w:ascii="Consolas" w:eastAsia="Times New Roman" w:hAnsi="Consolas" w:cs="Consolas"/>
@@ -4889,18 +4128,7 @@
           <w:szCs w:val="30"/>
           <w:lang w:val="en-US" w:eastAsia="pt-BR"/>
         </w:rPr>
-        <w:t>(</w:t>
-      </w:r>
-      <w:proofErr w:type="gramEnd"/>
-      <w:r>
-        <w:rPr>
-          <w:rFonts w:ascii="Consolas" w:eastAsia="Times New Roman" w:hAnsi="Consolas" w:cs="Consolas"/>
-          <w:color w:val="CCCCCC"/>
-          <w:sz w:val="30"/>
-          <w:szCs w:val="30"/>
-          <w:lang w:val="en-US" w:eastAsia="pt-BR"/>
-        </w:rPr>
-        <w:t>) {</w:t>
+        <w:t>() {</w:t>
       </w:r>
     </w:p>
     <w:p>
@@ -4963,9 +4191,38 @@
           <w:szCs w:val="30"/>
           <w:lang w:val="en-US" w:eastAsia="pt-BR"/>
         </w:rPr>
+        <w:t xml:space="preserve"> i </w:t>
+      </w:r>
+      <w:r>
+        <w:rPr>
+          <w:rFonts w:ascii="Consolas" w:eastAsia="Times New Roman" w:hAnsi="Consolas" w:cs="Consolas"/>
+          <w:color w:val="D4D4D4"/>
+          <w:sz w:val="30"/>
+          <w:szCs w:val="30"/>
+          <w:lang w:val="en-US" w:eastAsia="pt-BR"/>
+        </w:rPr>
+        <w:t>=</w:t>
+      </w:r>
+      <w:r>
+        <w:rPr>
+          <w:rFonts w:ascii="Consolas" w:eastAsia="Times New Roman" w:hAnsi="Consolas" w:cs="Consolas"/>
+          <w:color w:val="CCCCCC"/>
+          <w:sz w:val="30"/>
+          <w:szCs w:val="30"/>
+          <w:lang w:val="en-US" w:eastAsia="pt-BR"/>
+        </w:rPr>
         <w:t xml:space="preserve"> </w:t>
       </w:r>
-      <w:proofErr w:type="spellStart"/>
+      <w:r>
+        <w:rPr>
+          <w:rFonts w:ascii="Consolas" w:eastAsia="Times New Roman" w:hAnsi="Consolas" w:cs="Consolas"/>
+          <w:color w:val="B5CEA8"/>
+          <w:sz w:val="30"/>
+          <w:szCs w:val="30"/>
+          <w:lang w:val="en-US" w:eastAsia="pt-BR"/>
+        </w:rPr>
+        <w:t>0</w:t>
+      </w:r>
       <w:r>
         <w:rPr>
           <w:rFonts w:ascii="Consolas" w:eastAsia="Times New Roman" w:hAnsi="Consolas" w:cs="Consolas"/>
@@ -4974,9 +4231,18 @@
           <w:szCs w:val="30"/>
           <w:lang w:val="en-US" w:eastAsia="pt-BR"/>
         </w:rPr>
-        <w:t>i</w:t>
-      </w:r>
-      <w:proofErr w:type="spellEnd"/>
+        <w:t xml:space="preserve">; i </w:t>
+      </w:r>
+      <w:r>
+        <w:rPr>
+          <w:rFonts w:ascii="Consolas" w:eastAsia="Times New Roman" w:hAnsi="Consolas" w:cs="Consolas"/>
+          <w:color w:val="D4D4D4"/>
+          <w:sz w:val="30"/>
+          <w:szCs w:val="30"/>
+          <w:lang w:val="en-US" w:eastAsia="pt-BR"/>
+        </w:rPr>
+        <w:t>&lt;</w:t>
+      </w:r>
       <w:r>
         <w:rPr>
           <w:rFonts w:ascii="Consolas" w:eastAsia="Times New Roman" w:hAnsi="Consolas" w:cs="Consolas"/>
@@ -4990,12 +4256,32 @@
       <w:r>
         <w:rPr>
           <w:rFonts w:ascii="Consolas" w:eastAsia="Times New Roman" w:hAnsi="Consolas" w:cs="Consolas"/>
+          <w:color w:val="B5CEA8"/>
+          <w:sz w:val="30"/>
+          <w:szCs w:val="30"/>
+          <w:lang w:val="en-US" w:eastAsia="pt-BR"/>
+        </w:rPr>
+        <w:t>7</w:t>
+      </w:r>
+      <w:r>
+        <w:rPr>
+          <w:rFonts w:ascii="Consolas" w:eastAsia="Times New Roman" w:hAnsi="Consolas" w:cs="Consolas"/>
+          <w:color w:val="CCCCCC"/>
+          <w:sz w:val="30"/>
+          <w:szCs w:val="30"/>
+          <w:lang w:val="en-US" w:eastAsia="pt-BR"/>
+        </w:rPr>
+        <w:t>; i</w:t>
+      </w:r>
+      <w:r>
+        <w:rPr>
+          <w:rFonts w:ascii="Consolas" w:eastAsia="Times New Roman" w:hAnsi="Consolas" w:cs="Consolas"/>
           <w:color w:val="D4D4D4"/>
           <w:sz w:val="30"/>
           <w:szCs w:val="30"/>
           <w:lang w:val="en-US" w:eastAsia="pt-BR"/>
         </w:rPr>
-        <w:t>=</w:t>
+        <w:t>++</w:t>
       </w:r>
       <w:r>
         <w:rPr>
@@ -5005,134 +4291,8 @@
           <w:szCs w:val="30"/>
           <w:lang w:val="en-US" w:eastAsia="pt-BR"/>
         </w:rPr>
-        <w:t xml:space="preserve"> </w:t>
-      </w:r>
-      <w:r>
-        <w:rPr>
-          <w:rFonts w:ascii="Consolas" w:eastAsia="Times New Roman" w:hAnsi="Consolas" w:cs="Consolas"/>
-          <w:color w:val="B5CEA8"/>
-          <w:sz w:val="30"/>
-          <w:szCs w:val="30"/>
-          <w:lang w:val="en-US" w:eastAsia="pt-BR"/>
-        </w:rPr>
-        <w:t>0</w:t>
-      </w:r>
-      <w:r>
-        <w:rPr>
-          <w:rFonts w:ascii="Consolas" w:eastAsia="Times New Roman" w:hAnsi="Consolas" w:cs="Consolas"/>
-          <w:color w:val="CCCCCC"/>
-          <w:sz w:val="30"/>
-          <w:szCs w:val="30"/>
-          <w:lang w:val="en-US" w:eastAsia="pt-BR"/>
-        </w:rPr>
-        <w:t xml:space="preserve">; </w:t>
-      </w:r>
-      <w:proofErr w:type="spellStart"/>
-      <w:r>
-        <w:rPr>
-          <w:rFonts w:ascii="Consolas" w:eastAsia="Times New Roman" w:hAnsi="Consolas" w:cs="Consolas"/>
-          <w:color w:val="CCCCCC"/>
-          <w:sz w:val="30"/>
-          <w:szCs w:val="30"/>
-          <w:lang w:val="en-US" w:eastAsia="pt-BR"/>
-        </w:rPr>
-        <w:t>i</w:t>
-      </w:r>
-      <w:proofErr w:type="spellEnd"/>
-      <w:r>
-        <w:rPr>
-          <w:rFonts w:ascii="Consolas" w:eastAsia="Times New Roman" w:hAnsi="Consolas" w:cs="Consolas"/>
-          <w:color w:val="CCCCCC"/>
-          <w:sz w:val="30"/>
-          <w:szCs w:val="30"/>
-          <w:lang w:val="en-US" w:eastAsia="pt-BR"/>
-        </w:rPr>
-        <w:t xml:space="preserve"> </w:t>
-      </w:r>
-      <w:r>
-        <w:rPr>
-          <w:rFonts w:ascii="Consolas" w:eastAsia="Times New Roman" w:hAnsi="Consolas" w:cs="Consolas"/>
-          <w:color w:val="D4D4D4"/>
-          <w:sz w:val="30"/>
-          <w:szCs w:val="30"/>
-          <w:lang w:val="en-US" w:eastAsia="pt-BR"/>
-        </w:rPr>
-        <w:t>&lt;</w:t>
-      </w:r>
-      <w:r>
-        <w:rPr>
-          <w:rFonts w:ascii="Consolas" w:eastAsia="Times New Roman" w:hAnsi="Consolas" w:cs="Consolas"/>
-          <w:color w:val="CCCCCC"/>
-          <w:sz w:val="30"/>
-          <w:szCs w:val="30"/>
-          <w:lang w:val="en-US" w:eastAsia="pt-BR"/>
-        </w:rPr>
-        <w:t xml:space="preserve"> </w:t>
-      </w:r>
-      <w:r>
-        <w:rPr>
-          <w:rFonts w:ascii="Consolas" w:eastAsia="Times New Roman" w:hAnsi="Consolas" w:cs="Consolas"/>
-          <w:color w:val="B5CEA8"/>
-          <w:sz w:val="30"/>
-          <w:szCs w:val="30"/>
-          <w:lang w:val="en-US" w:eastAsia="pt-BR"/>
-        </w:rPr>
-        <w:t>7</w:t>
-      </w:r>
-      <w:r>
-        <w:rPr>
-          <w:rFonts w:ascii="Consolas" w:eastAsia="Times New Roman" w:hAnsi="Consolas" w:cs="Consolas"/>
-          <w:color w:val="CCCCCC"/>
-          <w:sz w:val="30"/>
-          <w:szCs w:val="30"/>
-          <w:lang w:val="en-US" w:eastAsia="pt-BR"/>
-        </w:rPr>
-        <w:t xml:space="preserve">; </w:t>
-      </w:r>
-      <w:proofErr w:type="spellStart"/>
-      <w:r>
-        <w:rPr>
-          <w:rFonts w:ascii="Consolas" w:eastAsia="Times New Roman" w:hAnsi="Consolas" w:cs="Consolas"/>
-          <w:color w:val="CCCCCC"/>
-          <w:sz w:val="30"/>
-          <w:szCs w:val="30"/>
-          <w:lang w:val="en-US" w:eastAsia="pt-BR"/>
-        </w:rPr>
-        <w:t>i</w:t>
-      </w:r>
-      <w:proofErr w:type="spellEnd"/>
-      <w:r>
-        <w:rPr>
-          <w:rFonts w:ascii="Consolas" w:eastAsia="Times New Roman" w:hAnsi="Consolas" w:cs="Consolas"/>
-          <w:color w:val="D4D4D4"/>
-          <w:sz w:val="30"/>
-          <w:szCs w:val="30"/>
-          <w:lang w:val="en-US" w:eastAsia="pt-BR"/>
-        </w:rPr>
-        <w:t>+</w:t>
-      </w:r>
-      <w:proofErr w:type="gramStart"/>
-      <w:r>
-        <w:rPr>
-          <w:rFonts w:ascii="Consolas" w:eastAsia="Times New Roman" w:hAnsi="Consolas" w:cs="Consolas"/>
-          <w:color w:val="D4D4D4"/>
-          <w:sz w:val="30"/>
-          <w:szCs w:val="30"/>
-          <w:lang w:val="en-US" w:eastAsia="pt-BR"/>
-        </w:rPr>
-        <w:t>+</w:t>
-      </w:r>
-      <w:r>
-        <w:rPr>
-          <w:rFonts w:ascii="Consolas" w:eastAsia="Times New Roman" w:hAnsi="Consolas" w:cs="Consolas"/>
-          <w:color w:val="CCCCCC"/>
-          <w:sz w:val="30"/>
-          <w:szCs w:val="30"/>
-          <w:lang w:val="en-US" w:eastAsia="pt-BR"/>
-        </w:rPr>
         <w:t>) {</w:t>
       </w:r>
-      <w:proofErr w:type="gramEnd"/>
     </w:p>
     <w:p>
       <w:pPr>
@@ -5156,7 +4316,6 @@
         </w:rPr>
         <w:t xml:space="preserve">    </w:t>
       </w:r>
-      <w:proofErr w:type="spellStart"/>
       <w:r>
         <w:rPr>
           <w:rFonts w:ascii="Consolas" w:eastAsia="Times New Roman" w:hAnsi="Consolas" w:cs="Consolas"/>
@@ -5167,7 +4326,6 @@
         </w:rPr>
         <w:t>pinMode</w:t>
       </w:r>
-      <w:proofErr w:type="spellEnd"/>
       <w:r>
         <w:rPr>
           <w:rFonts w:ascii="Consolas" w:eastAsia="Times New Roman" w:hAnsi="Consolas" w:cs="Consolas"/>
@@ -5178,7 +4336,6 @@
         </w:rPr>
         <w:t>(</w:t>
       </w:r>
-      <w:proofErr w:type="spellStart"/>
       <w:r>
         <w:rPr>
           <w:rFonts w:ascii="Consolas" w:eastAsia="Times New Roman" w:hAnsi="Consolas" w:cs="Consolas"/>
@@ -5189,7 +4346,6 @@
         </w:rPr>
         <w:t>segmentPins</w:t>
       </w:r>
-      <w:proofErr w:type="spellEnd"/>
       <w:r>
         <w:rPr>
           <w:rFonts w:ascii="Consolas" w:eastAsia="Times New Roman" w:hAnsi="Consolas" w:cs="Consolas"/>
@@ -5198,42 +4354,8 @@
           <w:szCs w:val="30"/>
           <w:lang w:val="en-US" w:eastAsia="pt-BR"/>
         </w:rPr>
-        <w:t>[</w:t>
-      </w:r>
-      <w:proofErr w:type="spellStart"/>
-      <w:r>
-        <w:rPr>
-          <w:rFonts w:ascii="Consolas" w:eastAsia="Times New Roman" w:hAnsi="Consolas" w:cs="Consolas"/>
-          <w:color w:val="CCCCCC"/>
-          <w:sz w:val="30"/>
-          <w:szCs w:val="30"/>
-          <w:lang w:val="en-US" w:eastAsia="pt-BR"/>
-        </w:rPr>
-        <w:t>i</w:t>
-      </w:r>
-      <w:proofErr w:type="spellEnd"/>
-      <w:r>
-        <w:rPr>
-          <w:rFonts w:ascii="Consolas" w:eastAsia="Times New Roman" w:hAnsi="Consolas" w:cs="Consolas"/>
-          <w:color w:val="CCCCCC"/>
-          <w:sz w:val="30"/>
-          <w:szCs w:val="30"/>
-          <w:lang w:val="en-US" w:eastAsia="pt-BR"/>
-        </w:rPr>
-        <w:t>], OUTPUT</w:t>
-      </w:r>
-      <w:proofErr w:type="gramStart"/>
-      <w:r>
-        <w:rPr>
-          <w:rFonts w:ascii="Consolas" w:eastAsia="Times New Roman" w:hAnsi="Consolas" w:cs="Consolas"/>
-          <w:color w:val="CCCCCC"/>
-          <w:sz w:val="30"/>
-          <w:szCs w:val="30"/>
-          <w:lang w:val="en-US" w:eastAsia="pt-BR"/>
-        </w:rPr>
-        <w:t>);</w:t>
-      </w:r>
-      <w:proofErr w:type="gramEnd"/>
+        <w:t>[i], OUTPUT);</w:t>
+      </w:r>
     </w:p>
     <w:p>
       <w:pPr>
@@ -5257,7 +4379,6 @@
         </w:rPr>
         <w:t xml:space="preserve">    </w:t>
       </w:r>
-      <w:proofErr w:type="spellStart"/>
       <w:r>
         <w:rPr>
           <w:rFonts w:ascii="Consolas" w:eastAsia="Times New Roman" w:hAnsi="Consolas" w:cs="Consolas"/>
@@ -5268,7 +4389,6 @@
         </w:rPr>
         <w:t>digitalWrite</w:t>
       </w:r>
-      <w:proofErr w:type="spellEnd"/>
       <w:r>
         <w:rPr>
           <w:rFonts w:ascii="Consolas" w:eastAsia="Times New Roman" w:hAnsi="Consolas" w:cs="Consolas"/>
@@ -5279,7 +4399,6 @@
         </w:rPr>
         <w:t>(</w:t>
       </w:r>
-      <w:proofErr w:type="spellStart"/>
       <w:r>
         <w:rPr>
           <w:rFonts w:ascii="Consolas" w:eastAsia="Times New Roman" w:hAnsi="Consolas" w:cs="Consolas"/>
@@ -5290,7 +4409,6 @@
         </w:rPr>
         <w:t>segmentPins</w:t>
       </w:r>
-      <w:proofErr w:type="spellEnd"/>
       <w:r>
         <w:rPr>
           <w:rFonts w:ascii="Consolas" w:eastAsia="Times New Roman" w:hAnsi="Consolas" w:cs="Consolas"/>
@@ -5299,42 +4417,8 @@
           <w:szCs w:val="30"/>
           <w:lang w:val="en-US" w:eastAsia="pt-BR"/>
         </w:rPr>
-        <w:t>[</w:t>
-      </w:r>
-      <w:proofErr w:type="spellStart"/>
-      <w:r>
-        <w:rPr>
-          <w:rFonts w:ascii="Consolas" w:eastAsia="Times New Roman" w:hAnsi="Consolas" w:cs="Consolas"/>
-          <w:color w:val="CCCCCC"/>
-          <w:sz w:val="30"/>
-          <w:szCs w:val="30"/>
-          <w:lang w:val="en-US" w:eastAsia="pt-BR"/>
-        </w:rPr>
-        <w:t>i</w:t>
-      </w:r>
-      <w:proofErr w:type="spellEnd"/>
-      <w:r>
-        <w:rPr>
-          <w:rFonts w:ascii="Consolas" w:eastAsia="Times New Roman" w:hAnsi="Consolas" w:cs="Consolas"/>
-          <w:color w:val="CCCCCC"/>
-          <w:sz w:val="30"/>
-          <w:szCs w:val="30"/>
-          <w:lang w:val="en-US" w:eastAsia="pt-BR"/>
-        </w:rPr>
-        <w:t>], LOW</w:t>
-      </w:r>
-      <w:proofErr w:type="gramStart"/>
-      <w:r>
-        <w:rPr>
-          <w:rFonts w:ascii="Consolas" w:eastAsia="Times New Roman" w:hAnsi="Consolas" w:cs="Consolas"/>
-          <w:color w:val="CCCCCC"/>
-          <w:sz w:val="30"/>
-          <w:szCs w:val="30"/>
-          <w:lang w:val="en-US" w:eastAsia="pt-BR"/>
-        </w:rPr>
-        <w:t>);</w:t>
-      </w:r>
-      <w:proofErr w:type="gramEnd"/>
+        <w:t>[i], LOW);</w:t>
+      </w:r>
     </w:p>
     <w:p>
       <w:pPr>
@@ -5427,7 +4511,6 @@
         </w:rPr>
         <w:t xml:space="preserve"> </w:t>
       </w:r>
-      <w:proofErr w:type="gramStart"/>
       <w:r>
         <w:rPr>
           <w:rFonts w:ascii="Consolas" w:eastAsia="Times New Roman" w:hAnsi="Consolas" w:cs="Consolas"/>
@@ -5446,18 +4529,7 @@
           <w:szCs w:val="30"/>
           <w:lang w:val="en-US" w:eastAsia="pt-BR"/>
         </w:rPr>
-        <w:t>(</w:t>
-      </w:r>
-      <w:proofErr w:type="gramEnd"/>
-      <w:r>
-        <w:rPr>
-          <w:rFonts w:ascii="Consolas" w:eastAsia="Times New Roman" w:hAnsi="Consolas" w:cs="Consolas"/>
-          <w:color w:val="CCCCCC"/>
-          <w:sz w:val="30"/>
-          <w:szCs w:val="30"/>
-          <w:lang w:val="en-US" w:eastAsia="pt-BR"/>
-        </w:rPr>
-        <w:t>) {</w:t>
+        <w:t>() {</w:t>
       </w:r>
     </w:p>
     <w:p>
@@ -5522,8 +4594,6 @@
         </w:rPr>
         <w:t xml:space="preserve"> </w:t>
       </w:r>
-      <w:proofErr w:type="spellStart"/>
-      <w:proofErr w:type="gramStart"/>
       <w:r>
         <w:rPr>
           <w:rFonts w:ascii="Consolas" w:eastAsia="Times New Roman" w:hAnsi="Consolas" w:cs="Consolas"/>
@@ -5554,8 +4624,6 @@
         </w:rPr>
         <w:t>getKey</w:t>
       </w:r>
-      <w:proofErr w:type="spellEnd"/>
-      <w:proofErr w:type="gramEnd"/>
       <w:r>
         <w:rPr>
           <w:rFonts w:ascii="Consolas" w:eastAsia="Times New Roman" w:hAnsi="Consolas" w:cs="Consolas"/>
@@ -5564,20 +4632,8 @@
           <w:szCs w:val="30"/>
           <w:lang w:val="en-US" w:eastAsia="pt-BR"/>
         </w:rPr>
-        <w:t>(</w:t>
-      </w:r>
-      <w:proofErr w:type="gramStart"/>
-      <w:r>
-        <w:rPr>
-          <w:rFonts w:ascii="Consolas" w:eastAsia="Times New Roman" w:hAnsi="Consolas" w:cs="Consolas"/>
-          <w:color w:val="CCCCCC"/>
-          <w:sz w:val="30"/>
-          <w:szCs w:val="30"/>
-          <w:lang w:val="en-US" w:eastAsia="pt-BR"/>
-        </w:rPr>
-        <w:t>);</w:t>
-      </w:r>
-      <w:proofErr w:type="gramEnd"/>
+        <w:t>();</w:t>
+      </w:r>
     </w:p>
     <w:p>
       <w:pPr>
@@ -5722,18 +4778,7 @@
           <w:szCs w:val="30"/>
           <w:lang w:val="en-US" w:eastAsia="pt-BR"/>
         </w:rPr>
-        <w:t>'9</w:t>
-      </w:r>
-      <w:proofErr w:type="gramStart"/>
-      <w:r>
-        <w:rPr>
-          <w:rFonts w:ascii="Consolas" w:eastAsia="Times New Roman" w:hAnsi="Consolas" w:cs="Consolas"/>
-          <w:color w:val="CE9178"/>
-          <w:sz w:val="30"/>
-          <w:szCs w:val="30"/>
-          <w:lang w:val="en-US" w:eastAsia="pt-BR"/>
-        </w:rPr>
-        <w:t>'</w:t>
+        <w:t>'9'</w:t>
       </w:r>
       <w:r>
         <w:rPr>
@@ -5745,7 +4790,6 @@
         </w:rPr>
         <w:t>) {</w:t>
       </w:r>
-      <w:proofErr w:type="gramEnd"/>
     </w:p>
     <w:p>
       <w:pPr>
@@ -5769,8 +4813,6 @@
         </w:rPr>
         <w:t xml:space="preserve">    </w:t>
       </w:r>
-      <w:proofErr w:type="spellStart"/>
-      <w:proofErr w:type="gramStart"/>
       <w:r>
         <w:rPr>
           <w:rFonts w:ascii="Consolas" w:eastAsia="Times New Roman" w:hAnsi="Consolas" w:cs="Consolas"/>
@@ -5781,7 +4823,6 @@
         </w:rPr>
         <w:t>displayDigit</w:t>
       </w:r>
-      <w:proofErr w:type="spellEnd"/>
       <w:r>
         <w:rPr>
           <w:rFonts w:ascii="Consolas" w:eastAsia="Times New Roman" w:hAnsi="Consolas" w:cs="Consolas"/>
@@ -5790,9 +4831,18 @@
           <w:szCs w:val="30"/>
           <w:lang w:val="en-US" w:eastAsia="pt-BR"/>
         </w:rPr>
-        <w:t>(</w:t>
-      </w:r>
-      <w:proofErr w:type="gramEnd"/>
+        <w:t xml:space="preserve">(key </w:t>
+      </w:r>
+      <w:r>
+        <w:rPr>
+          <w:rFonts w:ascii="Consolas" w:eastAsia="Times New Roman" w:hAnsi="Consolas" w:cs="Consolas"/>
+          <w:color w:val="D4D4D4"/>
+          <w:sz w:val="30"/>
+          <w:szCs w:val="30"/>
+          <w:lang w:val="en-US" w:eastAsia="pt-BR"/>
+        </w:rPr>
+        <w:t>-</w:t>
+      </w:r>
       <w:r>
         <w:rPr>
           <w:rFonts w:ascii="Consolas" w:eastAsia="Times New Roman" w:hAnsi="Consolas" w:cs="Consolas"/>
@@ -5801,17 +4851,17 @@
           <w:szCs w:val="30"/>
           <w:lang w:val="en-US" w:eastAsia="pt-BR"/>
         </w:rPr>
-        <w:t xml:space="preserve">key </w:t>
-      </w:r>
-      <w:r>
-        <w:rPr>
-          <w:rFonts w:ascii="Consolas" w:eastAsia="Times New Roman" w:hAnsi="Consolas" w:cs="Consolas"/>
-          <w:color w:val="D4D4D4"/>
-          <w:sz w:val="30"/>
-          <w:szCs w:val="30"/>
-          <w:lang w:val="en-US" w:eastAsia="pt-BR"/>
-        </w:rPr>
-        <w:t>-</w:t>
+        <w:t xml:space="preserve"> </w:t>
+      </w:r>
+      <w:r>
+        <w:rPr>
+          <w:rFonts w:ascii="Consolas" w:eastAsia="Times New Roman" w:hAnsi="Consolas" w:cs="Consolas"/>
+          <w:color w:val="CE9178"/>
+          <w:sz w:val="30"/>
+          <w:szCs w:val="30"/>
+          <w:lang w:val="en-US" w:eastAsia="pt-BR"/>
+        </w:rPr>
+        <w:t>'0'</w:t>
       </w:r>
       <w:r>
         <w:rPr>
@@ -5821,30 +4871,8 @@
           <w:szCs w:val="30"/>
           <w:lang w:val="en-US" w:eastAsia="pt-BR"/>
         </w:rPr>
-        <w:t xml:space="preserve"> </w:t>
-      </w:r>
-      <w:r>
-        <w:rPr>
-          <w:rFonts w:ascii="Consolas" w:eastAsia="Times New Roman" w:hAnsi="Consolas" w:cs="Consolas"/>
-          <w:color w:val="CE9178"/>
-          <w:sz w:val="30"/>
-          <w:szCs w:val="30"/>
-          <w:lang w:val="en-US" w:eastAsia="pt-BR"/>
-        </w:rPr>
-        <w:t>'0'</w:t>
-      </w:r>
-      <w:proofErr w:type="gramStart"/>
-      <w:r>
-        <w:rPr>
-          <w:rFonts w:ascii="Consolas" w:eastAsia="Times New Roman" w:hAnsi="Consolas" w:cs="Consolas"/>
-          <w:color w:val="CCCCCC"/>
-          <w:sz w:val="30"/>
-          <w:szCs w:val="30"/>
-          <w:lang w:val="en-US" w:eastAsia="pt-BR"/>
-        </w:rPr>
         <w:t>);</w:t>
       </w:r>
-      <w:proofErr w:type="gramEnd"/>
     </w:p>
     <w:p>
       <w:pPr>
@@ -5960,8 +4988,6 @@
         </w:rPr>
         <w:t xml:space="preserve"> </w:t>
       </w:r>
-      <w:proofErr w:type="spellStart"/>
-      <w:proofErr w:type="gramStart"/>
       <w:r>
         <w:rPr>
           <w:rFonts w:ascii="Consolas" w:eastAsia="Times New Roman" w:hAnsi="Consolas" w:cs="Consolas"/>
@@ -5972,7 +4998,6 @@
         </w:rPr>
         <w:t>displayDigit</w:t>
       </w:r>
-      <w:proofErr w:type="spellEnd"/>
       <w:r>
         <w:rPr>
           <w:rFonts w:ascii="Consolas" w:eastAsia="Times New Roman" w:hAnsi="Consolas" w:cs="Consolas"/>
@@ -5983,7 +5008,6 @@
         </w:rPr>
         <w:t>(</w:t>
       </w:r>
-      <w:proofErr w:type="gramEnd"/>
       <w:r>
         <w:rPr>
           <w:rFonts w:ascii="Consolas" w:eastAsia="Times New Roman" w:hAnsi="Consolas" w:cs="Consolas"/>
@@ -6004,7 +5028,6 @@
         </w:rPr>
         <w:t xml:space="preserve"> </w:t>
       </w:r>
-      <w:proofErr w:type="gramStart"/>
       <w:r>
         <w:rPr>
           <w:rFonts w:ascii="Consolas" w:eastAsia="Times New Roman" w:hAnsi="Consolas" w:cs="Consolas"/>
@@ -6025,7 +5048,6 @@
         </w:rPr>
         <w:t>) {</w:t>
       </w:r>
-      <w:proofErr w:type="gramEnd"/>
     </w:p>
     <w:p>
       <w:pPr>
@@ -6087,9 +5109,38 @@
           <w:szCs w:val="30"/>
           <w:lang w:val="en-US" w:eastAsia="pt-BR"/>
         </w:rPr>
+        <w:t xml:space="preserve"> i </w:t>
+      </w:r>
+      <w:r>
+        <w:rPr>
+          <w:rFonts w:ascii="Consolas" w:eastAsia="Times New Roman" w:hAnsi="Consolas" w:cs="Consolas"/>
+          <w:color w:val="D4D4D4"/>
+          <w:sz w:val="30"/>
+          <w:szCs w:val="30"/>
+          <w:lang w:val="en-US" w:eastAsia="pt-BR"/>
+        </w:rPr>
+        <w:t>=</w:t>
+      </w:r>
+      <w:r>
+        <w:rPr>
+          <w:rFonts w:ascii="Consolas" w:eastAsia="Times New Roman" w:hAnsi="Consolas" w:cs="Consolas"/>
+          <w:color w:val="CCCCCC"/>
+          <w:sz w:val="30"/>
+          <w:szCs w:val="30"/>
+          <w:lang w:val="en-US" w:eastAsia="pt-BR"/>
+        </w:rPr>
         <w:t xml:space="preserve"> </w:t>
       </w:r>
-      <w:proofErr w:type="spellStart"/>
+      <w:r>
+        <w:rPr>
+          <w:rFonts w:ascii="Consolas" w:eastAsia="Times New Roman" w:hAnsi="Consolas" w:cs="Consolas"/>
+          <w:color w:val="B5CEA8"/>
+          <w:sz w:val="30"/>
+          <w:szCs w:val="30"/>
+          <w:lang w:val="en-US" w:eastAsia="pt-BR"/>
+        </w:rPr>
+        <w:t>0</w:t>
+      </w:r>
       <w:r>
         <w:rPr>
           <w:rFonts w:ascii="Consolas" w:eastAsia="Times New Roman" w:hAnsi="Consolas" w:cs="Consolas"/>
@@ -6098,9 +5149,18 @@
           <w:szCs w:val="30"/>
           <w:lang w:val="en-US" w:eastAsia="pt-BR"/>
         </w:rPr>
-        <w:t>i</w:t>
-      </w:r>
-      <w:proofErr w:type="spellEnd"/>
+        <w:t xml:space="preserve">; i </w:t>
+      </w:r>
+      <w:r>
+        <w:rPr>
+          <w:rFonts w:ascii="Consolas" w:eastAsia="Times New Roman" w:hAnsi="Consolas" w:cs="Consolas"/>
+          <w:color w:val="D4D4D4"/>
+          <w:sz w:val="30"/>
+          <w:szCs w:val="30"/>
+          <w:lang w:val="en-US" w:eastAsia="pt-BR"/>
+        </w:rPr>
+        <w:t>&lt;</w:t>
+      </w:r>
       <w:r>
         <w:rPr>
           <w:rFonts w:ascii="Consolas" w:eastAsia="Times New Roman" w:hAnsi="Consolas" w:cs="Consolas"/>
@@ -6114,12 +5174,32 @@
       <w:r>
         <w:rPr>
           <w:rFonts w:ascii="Consolas" w:eastAsia="Times New Roman" w:hAnsi="Consolas" w:cs="Consolas"/>
+          <w:color w:val="B5CEA8"/>
+          <w:sz w:val="30"/>
+          <w:szCs w:val="30"/>
+          <w:lang w:val="en-US" w:eastAsia="pt-BR"/>
+        </w:rPr>
+        <w:t>7</w:t>
+      </w:r>
+      <w:r>
+        <w:rPr>
+          <w:rFonts w:ascii="Consolas" w:eastAsia="Times New Roman" w:hAnsi="Consolas" w:cs="Consolas"/>
+          <w:color w:val="CCCCCC"/>
+          <w:sz w:val="30"/>
+          <w:szCs w:val="30"/>
+          <w:lang w:val="en-US" w:eastAsia="pt-BR"/>
+        </w:rPr>
+        <w:t>; i</w:t>
+      </w:r>
+      <w:r>
+        <w:rPr>
+          <w:rFonts w:ascii="Consolas" w:eastAsia="Times New Roman" w:hAnsi="Consolas" w:cs="Consolas"/>
           <w:color w:val="D4D4D4"/>
           <w:sz w:val="30"/>
           <w:szCs w:val="30"/>
           <w:lang w:val="en-US" w:eastAsia="pt-BR"/>
         </w:rPr>
-        <w:t>=</w:t>
+        <w:t>++</w:t>
       </w:r>
       <w:r>
         <w:rPr>
@@ -6129,134 +5209,8 @@
           <w:szCs w:val="30"/>
           <w:lang w:val="en-US" w:eastAsia="pt-BR"/>
         </w:rPr>
-        <w:t xml:space="preserve"> </w:t>
-      </w:r>
-      <w:r>
-        <w:rPr>
-          <w:rFonts w:ascii="Consolas" w:eastAsia="Times New Roman" w:hAnsi="Consolas" w:cs="Consolas"/>
-          <w:color w:val="B5CEA8"/>
-          <w:sz w:val="30"/>
-          <w:szCs w:val="30"/>
-          <w:lang w:val="en-US" w:eastAsia="pt-BR"/>
-        </w:rPr>
-        <w:t>0</w:t>
-      </w:r>
-      <w:r>
-        <w:rPr>
-          <w:rFonts w:ascii="Consolas" w:eastAsia="Times New Roman" w:hAnsi="Consolas" w:cs="Consolas"/>
-          <w:color w:val="CCCCCC"/>
-          <w:sz w:val="30"/>
-          <w:szCs w:val="30"/>
-          <w:lang w:val="en-US" w:eastAsia="pt-BR"/>
-        </w:rPr>
-        <w:t xml:space="preserve">; </w:t>
-      </w:r>
-      <w:proofErr w:type="spellStart"/>
-      <w:r>
-        <w:rPr>
-          <w:rFonts w:ascii="Consolas" w:eastAsia="Times New Roman" w:hAnsi="Consolas" w:cs="Consolas"/>
-          <w:color w:val="CCCCCC"/>
-          <w:sz w:val="30"/>
-          <w:szCs w:val="30"/>
-          <w:lang w:val="en-US" w:eastAsia="pt-BR"/>
-        </w:rPr>
-        <w:t>i</w:t>
-      </w:r>
-      <w:proofErr w:type="spellEnd"/>
-      <w:r>
-        <w:rPr>
-          <w:rFonts w:ascii="Consolas" w:eastAsia="Times New Roman" w:hAnsi="Consolas" w:cs="Consolas"/>
-          <w:color w:val="CCCCCC"/>
-          <w:sz w:val="30"/>
-          <w:szCs w:val="30"/>
-          <w:lang w:val="en-US" w:eastAsia="pt-BR"/>
-        </w:rPr>
-        <w:t xml:space="preserve"> </w:t>
-      </w:r>
-      <w:r>
-        <w:rPr>
-          <w:rFonts w:ascii="Consolas" w:eastAsia="Times New Roman" w:hAnsi="Consolas" w:cs="Consolas"/>
-          <w:color w:val="D4D4D4"/>
-          <w:sz w:val="30"/>
-          <w:szCs w:val="30"/>
-          <w:lang w:val="en-US" w:eastAsia="pt-BR"/>
-        </w:rPr>
-        <w:t>&lt;</w:t>
-      </w:r>
-      <w:r>
-        <w:rPr>
-          <w:rFonts w:ascii="Consolas" w:eastAsia="Times New Roman" w:hAnsi="Consolas" w:cs="Consolas"/>
-          <w:color w:val="CCCCCC"/>
-          <w:sz w:val="30"/>
-          <w:szCs w:val="30"/>
-          <w:lang w:val="en-US" w:eastAsia="pt-BR"/>
-        </w:rPr>
-        <w:t xml:space="preserve"> </w:t>
-      </w:r>
-      <w:r>
-        <w:rPr>
-          <w:rFonts w:ascii="Consolas" w:eastAsia="Times New Roman" w:hAnsi="Consolas" w:cs="Consolas"/>
-          <w:color w:val="B5CEA8"/>
-          <w:sz w:val="30"/>
-          <w:szCs w:val="30"/>
-          <w:lang w:val="en-US" w:eastAsia="pt-BR"/>
-        </w:rPr>
-        <w:t>7</w:t>
-      </w:r>
-      <w:r>
-        <w:rPr>
-          <w:rFonts w:ascii="Consolas" w:eastAsia="Times New Roman" w:hAnsi="Consolas" w:cs="Consolas"/>
-          <w:color w:val="CCCCCC"/>
-          <w:sz w:val="30"/>
-          <w:szCs w:val="30"/>
-          <w:lang w:val="en-US" w:eastAsia="pt-BR"/>
-        </w:rPr>
-        <w:t xml:space="preserve">; </w:t>
-      </w:r>
-      <w:proofErr w:type="spellStart"/>
-      <w:r>
-        <w:rPr>
-          <w:rFonts w:ascii="Consolas" w:eastAsia="Times New Roman" w:hAnsi="Consolas" w:cs="Consolas"/>
-          <w:color w:val="CCCCCC"/>
-          <w:sz w:val="30"/>
-          <w:szCs w:val="30"/>
-          <w:lang w:val="en-US" w:eastAsia="pt-BR"/>
-        </w:rPr>
-        <w:t>i</w:t>
-      </w:r>
-      <w:proofErr w:type="spellEnd"/>
-      <w:r>
-        <w:rPr>
-          <w:rFonts w:ascii="Consolas" w:eastAsia="Times New Roman" w:hAnsi="Consolas" w:cs="Consolas"/>
-          <w:color w:val="D4D4D4"/>
-          <w:sz w:val="30"/>
-          <w:szCs w:val="30"/>
-          <w:lang w:val="en-US" w:eastAsia="pt-BR"/>
-        </w:rPr>
-        <w:t>+</w:t>
-      </w:r>
-      <w:proofErr w:type="gramStart"/>
-      <w:r>
-        <w:rPr>
-          <w:rFonts w:ascii="Consolas" w:eastAsia="Times New Roman" w:hAnsi="Consolas" w:cs="Consolas"/>
-          <w:color w:val="D4D4D4"/>
-          <w:sz w:val="30"/>
-          <w:szCs w:val="30"/>
-          <w:lang w:val="en-US" w:eastAsia="pt-BR"/>
-        </w:rPr>
-        <w:t>+</w:t>
-      </w:r>
-      <w:r>
-        <w:rPr>
-          <w:rFonts w:ascii="Consolas" w:eastAsia="Times New Roman" w:hAnsi="Consolas" w:cs="Consolas"/>
-          <w:color w:val="CCCCCC"/>
-          <w:sz w:val="30"/>
-          <w:szCs w:val="30"/>
-          <w:lang w:val="en-US" w:eastAsia="pt-BR"/>
-        </w:rPr>
         <w:t>) {</w:t>
       </w:r>
-      <w:proofErr w:type="gramEnd"/>
     </w:p>
     <w:p>
       <w:pPr>
@@ -6280,7 +5234,6 @@
         </w:rPr>
         <w:t xml:space="preserve">    </w:t>
       </w:r>
-      <w:proofErr w:type="spellStart"/>
       <w:r>
         <w:rPr>
           <w:rFonts w:ascii="Consolas" w:eastAsia="Times New Roman" w:hAnsi="Consolas" w:cs="Consolas"/>
@@ -6291,7 +5244,6 @@
         </w:rPr>
         <w:t>digitalWrite</w:t>
       </w:r>
-      <w:proofErr w:type="spellEnd"/>
       <w:r>
         <w:rPr>
           <w:rFonts w:ascii="Consolas" w:eastAsia="Times New Roman" w:hAnsi="Consolas" w:cs="Consolas"/>
@@ -6302,7 +5254,6 @@
         </w:rPr>
         <w:t>(</w:t>
       </w:r>
-      <w:proofErr w:type="spellStart"/>
       <w:r>
         <w:rPr>
           <w:rFonts w:ascii="Consolas" w:eastAsia="Times New Roman" w:hAnsi="Consolas" w:cs="Consolas"/>
@@ -6313,7 +5264,6 @@
         </w:rPr>
         <w:t>segmentPins</w:t>
       </w:r>
-      <w:proofErr w:type="spellEnd"/>
       <w:r>
         <w:rPr>
           <w:rFonts w:ascii="Consolas" w:eastAsia="Times New Roman" w:hAnsi="Consolas" w:cs="Consolas"/>
@@ -6324,7 +5274,6 @@
         </w:rPr>
         <w:t xml:space="preserve">[i], </w:t>
       </w:r>
-      <w:proofErr w:type="spellStart"/>
       <w:r>
         <w:rPr>
           <w:rFonts w:ascii="Consolas" w:eastAsia="Times New Roman" w:hAnsi="Consolas" w:cs="Consolas"/>
@@ -6335,7 +5284,6 @@
         </w:rPr>
         <w:t>digits</w:t>
       </w:r>
-      <w:proofErr w:type="spellEnd"/>
       <w:r>
         <w:rPr>
           <w:rFonts w:ascii="Consolas" w:eastAsia="Times New Roman" w:hAnsi="Consolas" w:cs="Consolas"/>

</xml_diff>